<commit_message>
modif file word tugas mysql
</commit_message>
<xml_diff>
--- a/mysql/tugas mysql_illyas Juffry Fauzi.docx
+++ b/mysql/tugas mysql_illyas Juffry Fauzi.docx
@@ -1,15 +1,586 @@
 
 <file path=word/document.xml><?xml version="1.0" encoding="utf-8"?>
-<w:document xmlns:wpc="http://schemas.microsoft.com/office/word/2010/wordprocessingCanvas" xmlns:cx="http://schemas.microsoft.com/office/drawing/2014/chartex" xmlns:cx1="http://schemas.microsoft.com/office/drawing/2015/9/8/chartex" xmlns:cx2="http://schemas.microsoft.com/office/drawing/2015/10/21/chartex" xmlns:cx3="http://schemas.microsoft.com/office/drawing/2016/5/9/chartex" xmlns:cx4="http://schemas.microsoft.com/office/drawing/2016/5/10/chartex" xmlns:cx5="http://schemas.microsoft.com/office/drawing/2016/5/11/chartex" xmlns:cx6="http://schemas.microsoft.com/office/drawing/2016/5/12/chartex" xmlns:cx7="http://schemas.microsoft.com/office/drawing/2016/5/13/chartex" xmlns:cx8="http://schemas.microsoft.com/office/drawing/2016/5/14/chartex" xmlns:mc="http://schemas.openxmlformats.org/markup-compatibility/2006" xmlns:aink="http://schemas.microsoft.com/office/drawing/2016/ink" xmlns:am3d="http://schemas.microsoft.com/office/drawing/2017/model3d" xmlns:o="urn:schemas-microsoft-com:office:office" xmlns:oel="http://schemas.microsoft.com/office/2019/extlst" xmlns:r="http://schemas.openxmlformats.org/officeDocument/2006/relationships" xmlns:m="http://schemas.openxmlformats.org/officeDocument/2006/math" xmlns:v="urn:schemas-microsoft-com:vml" xmlns:wp14="http://schemas.microsoft.com/office/word/2010/wordprocessingDrawing" xmlns:wp="http://schemas.openxmlformats.org/drawingml/2006/wordprocessingDrawing" xmlns:w10="urn:schemas-microsoft-com:office:word" xmlns:w="http://schemas.openxmlformats.org/wordprocessingml/2006/main" xmlns:w14="http://schemas.microsoft.com/office/word/2010/wordml" xmlns:w15="http://schemas.microsoft.com/office/word/2012/wordml" xmlns:w16cex="http://schemas.microsoft.com/office/word/2018/wordml/cex" xmlns:w16cid="http://schemas.microsoft.com/office/word/2016/wordml/cid" xmlns:w16="http://schemas.microsoft.com/office/word/2018/wordml" xmlns:w16du="http://schemas.microsoft.com/office/word/2023/wordml/word16du" xmlns:w16sdtdh="http://schemas.microsoft.com/office/word/2020/wordml/sdtdatahash" xmlns:w16sdtfl="http://schemas.microsoft.com/office/word/2024/wordml/sdtformatlock" xmlns:w16se="http://schemas.microsoft.com/office/word/2015/wordml/symex" xmlns:wpg="http://schemas.microsoft.com/office/word/2010/wordprocessingGroup" xmlns:wpi="http://schemas.microsoft.com/office/word/2010/wordprocessingInk" xmlns:wne="http://schemas.microsoft.com/office/word/2006/wordml" xmlns:wps="http://schemas.microsoft.com/office/word/2010/wordprocessingShape" mc:Ignorable="w14 w15 w16se w16cid w16 w16cex w16sdtdh w16sdtfl w16du wp14">
+<w:document xmlns:wpc="http://schemas.microsoft.com/office/word/2010/wordprocessingCanvas" xmlns:cx="http://schemas.microsoft.com/office/drawing/2014/chartex" xmlns:cx1="http://schemas.microsoft.com/office/drawing/2015/9/8/chartex" xmlns:cx2="http://schemas.microsoft.com/office/drawing/2015/10/21/chartex" xmlns:cx3="http://schemas.microsoft.com/office/drawing/2016/5/9/chartex" xmlns:cx4="http://schemas.microsoft.com/office/drawing/2016/5/10/chartex" xmlns:cx5="http://schemas.microsoft.com/office/drawing/2016/5/11/chartex" xmlns:cx6="http://schemas.microsoft.com/office/drawing/2016/5/12/chartex" xmlns:cx7="http://schemas.microsoft.com/office/drawing/2016/5/13/chartex" xmlns:cx8="http://schemas.microsoft.com/office/drawing/2016/5/14/chartex" xmlns:mc="http://schemas.openxmlformats.org/markup-compatibility/2006" xmlns:aink="http://schemas.microsoft.com/office/drawing/2016/ink" xmlns:am3d="http://schemas.microsoft.com/office/drawing/2017/model3d" xmlns:o="urn:schemas-microsoft-com:office:office" xmlns:r="http://schemas.openxmlformats.org/officeDocument/2006/relationships" xmlns:m="http://schemas.openxmlformats.org/officeDocument/2006/math" xmlns:v="urn:schemas-microsoft-com:vml" xmlns:wp14="http://schemas.microsoft.com/office/word/2010/wordprocessingDrawing" xmlns:wp="http://schemas.openxmlformats.org/drawingml/2006/wordprocessingDrawing" xmlns:w10="urn:schemas-microsoft-com:office:word" xmlns:w="http://schemas.openxmlformats.org/wordprocessingml/2006/main" xmlns:w14="http://schemas.microsoft.com/office/word/2010/wordml" xmlns:w15="http://schemas.microsoft.com/office/word/2012/wordml" xmlns:w16cex="http://schemas.microsoft.com/office/word/2018/wordml/cex" xmlns:w16cid="http://schemas.microsoft.com/office/word/2016/wordml/cid" xmlns:w16="http://schemas.microsoft.com/office/word/2018/wordml" xmlns:w16se="http://schemas.microsoft.com/office/word/2015/wordml/symex" xmlns:wpg="http://schemas.microsoft.com/office/word/2010/wordprocessingGroup" xmlns:wpi="http://schemas.microsoft.com/office/word/2010/wordprocessingInk" xmlns:wne="http://schemas.microsoft.com/office/word/2006/wordml" xmlns:wps="http://schemas.microsoft.com/office/word/2010/wordprocessingShape" mc:Ignorable="w14 w15 w16se w16cid w16 w16cex wp14">
   <w:body>
     <w:p>
       <w:pPr>
-        <w:ind w:left="720" w:hanging="360"/>
         <w:rPr>
           <w:b/>
           <w:bCs/>
         </w:rPr>
       </w:pPr>
+      <w:r>
+        <w:rPr>
+          <w:b/>
+          <w:bCs/>
+        </w:rPr>
+        <w:t>INSTAL ULANG OS DI VPS</w:t>
+      </w:r>
+    </w:p>
+    <w:p>
+      <w:pPr>
+        <w:jc w:val="center"/>
+        <w:rPr>
+          <w:b/>
+          <w:bCs/>
+        </w:rPr>
+      </w:pPr>
+      <w:r>
+        <w:rPr>
+          <w:b/>
+          <w:bCs/>
+        </w:rPr>
+        <w:drawing>
+          <wp:inline distT="0" distB="0" distL="0" distR="0" wp14:anchorId="0371C258" wp14:editId="3651FAF6">
+            <wp:extent cx="3686175" cy="2489169"/>
+            <wp:effectExtent l="0" t="0" r="0" b="6985"/>
+            <wp:docPr id="1" name="Picture 1"/>
+            <wp:cNvGraphicFramePr>
+              <a:graphicFrameLocks xmlns:a="http://schemas.openxmlformats.org/drawingml/2006/main" noChangeAspect="1"/>
+            </wp:cNvGraphicFramePr>
+            <a:graphic xmlns:a="http://schemas.openxmlformats.org/drawingml/2006/main">
+              <a:graphicData uri="http://schemas.openxmlformats.org/drawingml/2006/picture">
+                <pic:pic xmlns:pic="http://schemas.openxmlformats.org/drawingml/2006/picture">
+                  <pic:nvPicPr>
+                    <pic:cNvPr id="1" name=""/>
+                    <pic:cNvPicPr/>
+                  </pic:nvPicPr>
+                  <pic:blipFill>
+                    <a:blip r:embed="rId5"/>
+                    <a:stretch>
+                      <a:fillRect/>
+                    </a:stretch>
+                  </pic:blipFill>
+                  <pic:spPr>
+                    <a:xfrm>
+                      <a:off x="0" y="0"/>
+                      <a:ext cx="3720644" cy="2512445"/>
+                    </a:xfrm>
+                    <a:prstGeom prst="rect">
+                      <a:avLst/>
+                    </a:prstGeom>
+                  </pic:spPr>
+                </pic:pic>
+              </a:graphicData>
+            </a:graphic>
+          </wp:inline>
+        </w:drawing>
+      </w:r>
+    </w:p>
+    <w:p>
+      <w:pPr>
+        <w:pStyle w:val="ListParagraph"/>
+        <w:numPr>
+          <w:ilvl w:val="0"/>
+          <w:numId w:val="6"/>
+        </w:numPr>
+      </w:pPr>
+      <w:r>
+        <w:t>Klik tombol install ulah di bawah sebelah kanan</w:t>
+      </w:r>
+    </w:p>
+    <w:p>
+      <w:pPr>
+        <w:jc w:val="center"/>
+      </w:pPr>
+      <w:r>
+        <w:drawing>
+          <wp:inline distT="0" distB="0" distL="0" distR="0" wp14:anchorId="5491F828" wp14:editId="099A3A68">
+            <wp:extent cx="3467100" cy="2623419"/>
+            <wp:effectExtent l="0" t="0" r="0" b="5715"/>
+            <wp:docPr id="2" name="Picture 2"/>
+            <wp:cNvGraphicFramePr>
+              <a:graphicFrameLocks xmlns:a="http://schemas.openxmlformats.org/drawingml/2006/main" noChangeAspect="1"/>
+            </wp:cNvGraphicFramePr>
+            <a:graphic xmlns:a="http://schemas.openxmlformats.org/drawingml/2006/main">
+              <a:graphicData uri="http://schemas.openxmlformats.org/drawingml/2006/picture">
+                <pic:pic xmlns:pic="http://schemas.openxmlformats.org/drawingml/2006/picture">
+                  <pic:nvPicPr>
+                    <pic:cNvPr id="1" name=""/>
+                    <pic:cNvPicPr/>
+                  </pic:nvPicPr>
+                  <pic:blipFill>
+                    <a:blip r:embed="rId6"/>
+                    <a:stretch>
+                      <a:fillRect/>
+                    </a:stretch>
+                  </pic:blipFill>
+                  <pic:spPr>
+                    <a:xfrm>
+                      <a:off x="0" y="0"/>
+                      <a:ext cx="3495435" cy="2644859"/>
+                    </a:xfrm>
+                    <a:prstGeom prst="rect">
+                      <a:avLst/>
+                    </a:prstGeom>
+                  </pic:spPr>
+                </pic:pic>
+              </a:graphicData>
+            </a:graphic>
+          </wp:inline>
+        </w:drawing>
+      </w:r>
+    </w:p>
+    <w:p>
+      <w:pPr>
+        <w:pStyle w:val="ListParagraph"/>
+        <w:numPr>
+          <w:ilvl w:val="0"/>
+          <w:numId w:val="6"/>
+        </w:numPr>
+      </w:pPr>
+      <w:r>
+        <w:t>Masukan hostname yang ada di atas form dan klik selanjutnya</w:t>
+      </w:r>
+    </w:p>
+    <w:p>
+      <w:pPr>
+        <w:jc w:val="center"/>
+      </w:pPr>
+      <w:r>
+        <w:drawing>
+          <wp:inline distT="0" distB="0" distL="0" distR="0" wp14:anchorId="70F15286" wp14:editId="4DC9EC6E">
+            <wp:extent cx="3667125" cy="1870844"/>
+            <wp:effectExtent l="0" t="0" r="0" b="0"/>
+            <wp:docPr id="3" name="Picture 3"/>
+            <wp:cNvGraphicFramePr>
+              <a:graphicFrameLocks xmlns:a="http://schemas.openxmlformats.org/drawingml/2006/main" noChangeAspect="1"/>
+            </wp:cNvGraphicFramePr>
+            <a:graphic xmlns:a="http://schemas.openxmlformats.org/drawingml/2006/main">
+              <a:graphicData uri="http://schemas.openxmlformats.org/drawingml/2006/picture">
+                <pic:pic xmlns:pic="http://schemas.openxmlformats.org/drawingml/2006/picture">
+                  <pic:nvPicPr>
+                    <pic:cNvPr id="1" name=""/>
+                    <pic:cNvPicPr/>
+                  </pic:nvPicPr>
+                  <pic:blipFill>
+                    <a:blip r:embed="rId7"/>
+                    <a:stretch>
+                      <a:fillRect/>
+                    </a:stretch>
+                  </pic:blipFill>
+                  <pic:spPr>
+                    <a:xfrm>
+                      <a:off x="0" y="0"/>
+                      <a:ext cx="3712858" cy="1894176"/>
+                    </a:xfrm>
+                    <a:prstGeom prst="rect">
+                      <a:avLst/>
+                    </a:prstGeom>
+                  </pic:spPr>
+                </pic:pic>
+              </a:graphicData>
+            </a:graphic>
+          </wp:inline>
+        </w:drawing>
+      </w:r>
+    </w:p>
+    <w:p>
+      <w:pPr>
+        <w:pStyle w:val="ListParagraph"/>
+        <w:numPr>
+          <w:ilvl w:val="0"/>
+          <w:numId w:val="6"/>
+        </w:numPr>
+      </w:pPr>
+      <w:r>
+        <w:t>Buat password baru untuk root dan klik simpan, tunggu sampai proses install ulang sellesai</w:t>
+      </w:r>
+    </w:p>
+    <w:p>
+      <w:pPr>
+        <w:ind w:left="360"/>
+        <w:jc w:val="center"/>
+      </w:pPr>
+      <w:r>
+        <w:rPr>
+          <w:noProof/>
+        </w:rPr>
+        <w:lastRenderedPageBreak/>
+        <w:drawing>
+          <wp:inline distT="0" distB="0" distL="0" distR="0" wp14:anchorId="460AA77A" wp14:editId="5A57C539">
+            <wp:extent cx="5271489" cy="1695450"/>
+            <wp:effectExtent l="0" t="0" r="5715" b="0"/>
+            <wp:docPr id="4" name="Picture 4"/>
+            <wp:cNvGraphicFramePr>
+              <a:graphicFrameLocks xmlns:a="http://schemas.openxmlformats.org/drawingml/2006/main" noChangeAspect="1"/>
+            </wp:cNvGraphicFramePr>
+            <a:graphic xmlns:a="http://schemas.openxmlformats.org/drawingml/2006/main">
+              <a:graphicData uri="http://schemas.openxmlformats.org/drawingml/2006/picture">
+                <pic:pic xmlns:pic="http://schemas.openxmlformats.org/drawingml/2006/picture">
+                  <pic:nvPicPr>
+                    <pic:cNvPr id="1" name=""/>
+                    <pic:cNvPicPr/>
+                  </pic:nvPicPr>
+                  <pic:blipFill>
+                    <a:blip r:embed="rId8"/>
+                    <a:stretch>
+                      <a:fillRect/>
+                    </a:stretch>
+                  </pic:blipFill>
+                  <pic:spPr>
+                    <a:xfrm>
+                      <a:off x="0" y="0"/>
+                      <a:ext cx="5320778" cy="1711303"/>
+                    </a:xfrm>
+                    <a:prstGeom prst="rect">
+                      <a:avLst/>
+                    </a:prstGeom>
+                  </pic:spPr>
+                </pic:pic>
+              </a:graphicData>
+            </a:graphic>
+          </wp:inline>
+        </w:drawing>
+      </w:r>
+    </w:p>
+    <w:p>
+      <w:pPr>
+        <w:ind w:left="360"/>
+        <w:jc w:val="center"/>
+      </w:pPr>
+      <w:r>
+        <w:rPr>
+          <w:noProof/>
+        </w:rPr>
+        <w:drawing>
+          <wp:inline distT="0" distB="0" distL="0" distR="0" wp14:anchorId="4791B616" wp14:editId="51C738CC">
+            <wp:extent cx="3819525" cy="3301397"/>
+            <wp:effectExtent l="0" t="0" r="0" b="0"/>
+            <wp:docPr id="5" name="Picture 5"/>
+            <wp:cNvGraphicFramePr>
+              <a:graphicFrameLocks xmlns:a="http://schemas.openxmlformats.org/drawingml/2006/main" noChangeAspect="1"/>
+            </wp:cNvGraphicFramePr>
+            <a:graphic xmlns:a="http://schemas.openxmlformats.org/drawingml/2006/main">
+              <a:graphicData uri="http://schemas.openxmlformats.org/drawingml/2006/picture">
+                <pic:pic xmlns:pic="http://schemas.openxmlformats.org/drawingml/2006/picture">
+                  <pic:nvPicPr>
+                    <pic:cNvPr id="1" name=""/>
+                    <pic:cNvPicPr/>
+                  </pic:nvPicPr>
+                  <pic:blipFill>
+                    <a:blip r:embed="rId9"/>
+                    <a:stretch>
+                      <a:fillRect/>
+                    </a:stretch>
+                  </pic:blipFill>
+                  <pic:spPr>
+                    <a:xfrm>
+                      <a:off x="0" y="0"/>
+                      <a:ext cx="3830840" cy="3311177"/>
+                    </a:xfrm>
+                    <a:prstGeom prst="rect">
+                      <a:avLst/>
+                    </a:prstGeom>
+                  </pic:spPr>
+                </pic:pic>
+              </a:graphicData>
+            </a:graphic>
+          </wp:inline>
+        </w:drawing>
+      </w:r>
+    </w:p>
+    <w:p>
+      <w:pPr>
+        <w:pStyle w:val="ListParagraph"/>
+        <w:numPr>
+          <w:ilvl w:val="0"/>
+          <w:numId w:val="6"/>
+        </w:numPr>
+      </w:pPr>
+      <w:r>
+        <w:t>Pilih OS yang akan digunakan dan versi dan klik selanjutnya</w:t>
+      </w:r>
+    </w:p>
+    <w:p>
+      <w:pPr>
+        <w:pStyle w:val="ListParagraph"/>
+      </w:pPr>
+    </w:p>
+    <w:p>
+      <w:pPr>
+        <w:pStyle w:val="ListParagraph"/>
+        <w:jc w:val="center"/>
+      </w:pPr>
+      <w:r>
+        <w:drawing>
+          <wp:inline distT="0" distB="0" distL="0" distR="0" wp14:anchorId="77C54776" wp14:editId="4EE4ED42">
+            <wp:extent cx="4174434" cy="2503147"/>
+            <wp:effectExtent l="0" t="0" r="0" b="0"/>
+            <wp:docPr id="6" name="Picture 6"/>
+            <wp:cNvGraphicFramePr>
+              <a:graphicFrameLocks xmlns:a="http://schemas.openxmlformats.org/drawingml/2006/main" noChangeAspect="1"/>
+            </wp:cNvGraphicFramePr>
+            <a:graphic xmlns:a="http://schemas.openxmlformats.org/drawingml/2006/main">
+              <a:graphicData uri="http://schemas.openxmlformats.org/drawingml/2006/picture">
+                <pic:pic xmlns:pic="http://schemas.openxmlformats.org/drawingml/2006/picture">
+                  <pic:nvPicPr>
+                    <pic:cNvPr id="1" name=""/>
+                    <pic:cNvPicPr/>
+                  </pic:nvPicPr>
+                  <pic:blipFill>
+                    <a:blip r:embed="rId10"/>
+                    <a:stretch>
+                      <a:fillRect/>
+                    </a:stretch>
+                  </pic:blipFill>
+                  <pic:spPr>
+                    <a:xfrm>
+                      <a:off x="0" y="0"/>
+                      <a:ext cx="4194046" cy="2514907"/>
+                    </a:xfrm>
+                    <a:prstGeom prst="rect">
+                      <a:avLst/>
+                    </a:prstGeom>
+                  </pic:spPr>
+                </pic:pic>
+              </a:graphicData>
+            </a:graphic>
+          </wp:inline>
+        </w:drawing>
+      </w:r>
+    </w:p>
+    <w:p>
+      <w:pPr>
+        <w:pStyle w:val="ListParagraph"/>
+        <w:jc w:val="center"/>
+      </w:pPr>
+    </w:p>
+    <w:p>
+      <w:pPr>
+        <w:pStyle w:val="ListParagraph"/>
+        <w:numPr>
+          <w:ilvl w:val="0"/>
+          <w:numId w:val="6"/>
+        </w:numPr>
+      </w:pPr>
+      <w:r>
+        <w:t>Masukan password baru untuk root</w:t>
+      </w:r>
+      <w:r>
+        <w:t xml:space="preserve"> klik ganti OS dan tunggu sampai prosesnya selesai</w:t>
+      </w:r>
+    </w:p>
+    <w:p>
+      <w:pPr>
+        <w:pStyle w:val="ListParagraph"/>
+      </w:pPr>
+    </w:p>
+    <w:p>
+      <w:r>
+        <w:br w:type="page"/>
+      </w:r>
+    </w:p>
+    <w:p>
+      <w:pPr>
+        <w:pStyle w:val="ListParagraph"/>
+        <w:jc w:val="center"/>
+      </w:pPr>
+      <w:r>
+        <w:lastRenderedPageBreak/>
+        <w:drawing>
+          <wp:inline distT="0" distB="0" distL="0" distR="0" wp14:anchorId="543CBEE0" wp14:editId="5F49D176">
+            <wp:extent cx="4977516" cy="1351087"/>
+            <wp:effectExtent l="0" t="0" r="0" b="1905"/>
+            <wp:docPr id="7" name="Picture 7"/>
+            <wp:cNvGraphicFramePr>
+              <a:graphicFrameLocks xmlns:a="http://schemas.openxmlformats.org/drawingml/2006/main" noChangeAspect="1"/>
+            </wp:cNvGraphicFramePr>
+            <a:graphic xmlns:a="http://schemas.openxmlformats.org/drawingml/2006/main">
+              <a:graphicData uri="http://schemas.openxmlformats.org/drawingml/2006/picture">
+                <pic:pic xmlns:pic="http://schemas.openxmlformats.org/drawingml/2006/picture">
+                  <pic:nvPicPr>
+                    <pic:cNvPr id="1" name=""/>
+                    <pic:cNvPicPr/>
+                  </pic:nvPicPr>
+                  <pic:blipFill>
+                    <a:blip r:embed="rId11"/>
+                    <a:stretch>
+                      <a:fillRect/>
+                    </a:stretch>
+                  </pic:blipFill>
+                  <pic:spPr>
+                    <a:xfrm>
+                      <a:off x="0" y="0"/>
+                      <a:ext cx="4993477" cy="1355419"/>
+                    </a:xfrm>
+                    <a:prstGeom prst="rect">
+                      <a:avLst/>
+                    </a:prstGeom>
+                  </pic:spPr>
+                </pic:pic>
+              </a:graphicData>
+            </a:graphic>
+          </wp:inline>
+        </w:drawing>
+      </w:r>
+    </w:p>
+    <w:p>
+      <w:pPr>
+        <w:pStyle w:val="ListParagraph"/>
+        <w:jc w:val="center"/>
+      </w:pPr>
+    </w:p>
+    <w:p>
+      <w:pPr>
+        <w:pStyle w:val="ListParagraph"/>
+        <w:numPr>
+          <w:ilvl w:val="0"/>
+          <w:numId w:val="6"/>
+        </w:numPr>
+      </w:pPr>
+      <w:r>
+        <w:t>Klik console Web untuk membuka terminal vps</w:t>
+      </w:r>
+    </w:p>
+    <w:p>
+      <w:pPr>
+        <w:pStyle w:val="ListParagraph"/>
+        <w:ind w:left="0"/>
+        <w:jc w:val="center"/>
+      </w:pPr>
+    </w:p>
+    <w:p>
+      <w:pPr>
+        <w:pStyle w:val="ListParagraph"/>
+        <w:ind w:left="0"/>
+        <w:jc w:val="center"/>
+      </w:pPr>
+      <w:r>
+        <w:drawing>
+          <wp:inline distT="0" distB="0" distL="0" distR="0" wp14:anchorId="5033BE2B" wp14:editId="599FFB44">
+            <wp:extent cx="3673503" cy="3842811"/>
+            <wp:effectExtent l="0" t="0" r="3175" b="5715"/>
+            <wp:docPr id="8" name="Picture 8"/>
+            <wp:cNvGraphicFramePr>
+              <a:graphicFrameLocks xmlns:a="http://schemas.openxmlformats.org/drawingml/2006/main" noChangeAspect="1"/>
+            </wp:cNvGraphicFramePr>
+            <a:graphic xmlns:a="http://schemas.openxmlformats.org/drawingml/2006/main">
+              <a:graphicData uri="http://schemas.openxmlformats.org/drawingml/2006/picture">
+                <pic:pic xmlns:pic="http://schemas.openxmlformats.org/drawingml/2006/picture">
+                  <pic:nvPicPr>
+                    <pic:cNvPr id="1" name=""/>
+                    <pic:cNvPicPr/>
+                  </pic:nvPicPr>
+                  <pic:blipFill>
+                    <a:blip r:embed="rId12"/>
+                    <a:stretch>
+                      <a:fillRect/>
+                    </a:stretch>
+                  </pic:blipFill>
+                  <pic:spPr>
+                    <a:xfrm>
+                      <a:off x="0" y="0"/>
+                      <a:ext cx="3679455" cy="3849037"/>
+                    </a:xfrm>
+                    <a:prstGeom prst="rect">
+                      <a:avLst/>
+                    </a:prstGeom>
+                  </pic:spPr>
+                </pic:pic>
+              </a:graphicData>
+            </a:graphic>
+          </wp:inline>
+        </w:drawing>
+      </w:r>
+    </w:p>
+    <w:p>
+      <w:pPr>
+        <w:pStyle w:val="ListParagraph"/>
+        <w:ind w:left="0"/>
+        <w:jc w:val="center"/>
+      </w:pPr>
+    </w:p>
+    <w:p>
+      <w:pPr>
+        <w:pStyle w:val="ListParagraph"/>
+        <w:numPr>
+          <w:ilvl w:val="0"/>
+          <w:numId w:val="6"/>
+        </w:numPr>
+      </w:pPr>
+      <w:r>
+        <w:t xml:space="preserve">Update aplikasi =&gt; sudo apt update </w:t>
+      </w:r>
+    </w:p>
+    <w:p>
+      <w:pPr>
+        <w:pStyle w:val="ListParagraph"/>
+        <w:jc w:val="center"/>
+      </w:pPr>
+      <w:r>
+        <w:drawing>
+          <wp:inline distT="0" distB="0" distL="0" distR="0" wp14:anchorId="589AD758" wp14:editId="05432DA0">
+            <wp:extent cx="4826441" cy="2130350"/>
+            <wp:effectExtent l="0" t="0" r="0" b="3810"/>
+            <wp:docPr id="9" name="Picture 9"/>
+            <wp:cNvGraphicFramePr>
+              <a:graphicFrameLocks xmlns:a="http://schemas.openxmlformats.org/drawingml/2006/main" noChangeAspect="1"/>
+            </wp:cNvGraphicFramePr>
+            <a:graphic xmlns:a="http://schemas.openxmlformats.org/drawingml/2006/main">
+              <a:graphicData uri="http://schemas.openxmlformats.org/drawingml/2006/picture">
+                <pic:pic xmlns:pic="http://schemas.openxmlformats.org/drawingml/2006/picture">
+                  <pic:nvPicPr>
+                    <pic:cNvPr id="1" name=""/>
+                    <pic:cNvPicPr/>
+                  </pic:nvPicPr>
+                  <pic:blipFill>
+                    <a:blip r:embed="rId13"/>
+                    <a:stretch>
+                      <a:fillRect/>
+                    </a:stretch>
+                  </pic:blipFill>
+                  <pic:spPr>
+                    <a:xfrm>
+                      <a:off x="0" y="0"/>
+                      <a:ext cx="4846608" cy="2139251"/>
+                    </a:xfrm>
+                    <a:prstGeom prst="rect">
+                      <a:avLst/>
+                    </a:prstGeom>
+                  </pic:spPr>
+                </pic:pic>
+              </a:graphicData>
+            </a:graphic>
+          </wp:inline>
+        </w:drawing>
+      </w:r>
+    </w:p>
+    <w:p>
+      <w:pPr>
+        <w:pStyle w:val="ListParagraph"/>
+        <w:numPr>
+          <w:ilvl w:val="0"/>
+          <w:numId w:val="6"/>
+        </w:numPr>
+      </w:pPr>
+      <w:r>
+        <w:t>Upgrade versi =&gt; sudo apt upgrade</w:t>
+      </w:r>
+    </w:p>
+    <w:p>
+      <w:r>
+        <w:br w:type="page"/>
+      </w:r>
+    </w:p>
+    <w:p>
+      <w:pPr>
+        <w:ind w:left="720" w:hanging="360"/>
+        <w:rPr>
+          <w:b/>
+          <w:bCs/>
+        </w:rPr>
+      </w:pPr>
+      <w:bookmarkStart w:id="0" w:name="_GoBack"/>
+      <w:bookmarkEnd w:id="0"/>
+      <w:r>
+        <w:rPr>
+          <w:b/>
+          <w:bCs/>
+        </w:rPr>
+        <w:lastRenderedPageBreak/>
+        <w:t xml:space="preserve">INSTAL DAN </w:t>
+      </w:r>
       <w:r>
         <w:rPr>
           <w:b/>
@@ -26,52 +597,21 @@
           <w:numId w:val="1"/>
         </w:numPr>
       </w:pPr>
-      <w:proofErr w:type="spellStart"/>
-      <w:r>
-        <w:t>Instal</w:t>
-      </w:r>
-      <w:proofErr w:type="spellEnd"/>
-      <w:r>
-        <w:t xml:space="preserve"> </w:t>
-      </w:r>
-      <w:proofErr w:type="spellStart"/>
-      <w:r>
-        <w:t>mysql</w:t>
-      </w:r>
-      <w:proofErr w:type="spellEnd"/>
-      <w:r>
-        <w:t xml:space="preserve"> server di </w:t>
-      </w:r>
-      <w:proofErr w:type="spellStart"/>
-      <w:r>
-        <w:t>pvs</w:t>
-      </w:r>
-      <w:proofErr w:type="spellEnd"/>
-      <w:r>
-        <w:t xml:space="preserve"> =&gt; </w:t>
-      </w:r>
-      <w:proofErr w:type="spellStart"/>
-      <w:r>
-        <w:t>sudo</w:t>
-      </w:r>
-      <w:proofErr w:type="spellEnd"/>
-      <w:r>
-        <w:t xml:space="preserve"> apt install </w:t>
-      </w:r>
-      <w:proofErr w:type="spellStart"/>
-      <w:r>
-        <w:t>mysql</w:t>
-      </w:r>
-      <w:proofErr w:type="spellEnd"/>
-      <w:r>
-        <w:t>-server</w:t>
-      </w:r>
-    </w:p>
-    <w:p>
-      <w:pPr>
-        <w:jc w:val="center"/>
-      </w:pPr>
-      <w:r>
+      <w:r>
+        <w:t xml:space="preserve">Instal mysql server di pvs =&gt; </w:t>
+      </w:r>
+      <w:r>
+        <w:t>sudo apt install mysql-server</w:t>
+      </w:r>
+    </w:p>
+    <w:p>
+      <w:pPr>
+        <w:jc w:val="center"/>
+      </w:pPr>
+      <w:r>
+        <w:rPr>
+          <w:noProof/>
+        </w:rPr>
         <w:drawing>
           <wp:inline distT="0" distB="0" distL="0" distR="0" wp14:anchorId="3E092904" wp14:editId="3E30FCA8">
             <wp:extent cx="4895850" cy="2417587"/>
@@ -88,7 +628,7 @@
                     <pic:cNvPicPr/>
                   </pic:nvPicPr>
                   <pic:blipFill>
-                    <a:blip r:embed="rId5"/>
+                    <a:blip r:embed="rId14"/>
                     <a:stretch>
                       <a:fillRect/>
                     </a:stretch>
@@ -117,49 +657,21 @@
           <w:numId w:val="1"/>
         </w:numPr>
       </w:pPr>
-      <w:proofErr w:type="spellStart"/>
-      <w:r>
-        <w:t>Konfigurasi</w:t>
-      </w:r>
-      <w:proofErr w:type="spellEnd"/>
-      <w:r>
-        <w:t xml:space="preserve"> </w:t>
-      </w:r>
-      <w:proofErr w:type="spellStart"/>
-      <w:r>
-        <w:t>keamanan</w:t>
-      </w:r>
-      <w:proofErr w:type="spellEnd"/>
-      <w:r>
-        <w:t xml:space="preserve"> </w:t>
-      </w:r>
-      <w:proofErr w:type="spellStart"/>
-      <w:r>
-        <w:t>mysql</w:t>
-      </w:r>
-      <w:proofErr w:type="spellEnd"/>
-      <w:r>
-        <w:t xml:space="preserve"> =&gt; </w:t>
-      </w:r>
-      <w:proofErr w:type="spellStart"/>
-      <w:r>
-        <w:t>sudo</w:t>
-      </w:r>
-      <w:proofErr w:type="spellEnd"/>
-      <w:r>
-        <w:t xml:space="preserve"> </w:t>
-      </w:r>
-      <w:proofErr w:type="spellStart"/>
-      <w:r>
-        <w:t>mysql_secure_installation</w:t>
-      </w:r>
-      <w:proofErr w:type="spellEnd"/>
-    </w:p>
-    <w:p>
-      <w:pPr>
-        <w:jc w:val="center"/>
-      </w:pPr>
-      <w:r>
+      <w:r>
+        <w:t xml:space="preserve">Konfigurasi keamanan mysql =&gt; </w:t>
+      </w:r>
+      <w:r>
+        <w:t>sudo mysql_secure_installation</w:t>
+      </w:r>
+    </w:p>
+    <w:p>
+      <w:pPr>
+        <w:jc w:val="center"/>
+      </w:pPr>
+      <w:r>
+        <w:rPr>
+          <w:noProof/>
+        </w:rPr>
         <w:drawing>
           <wp:inline distT="0" distB="0" distL="0" distR="0" wp14:anchorId="7D61E303" wp14:editId="313893A8">
             <wp:extent cx="4819650" cy="2401071"/>
@@ -176,7 +688,7 @@
                     <pic:cNvPicPr/>
                   </pic:nvPicPr>
                   <pic:blipFill>
-                    <a:blip r:embed="rId6"/>
+                    <a:blip r:embed="rId15"/>
                     <a:stretch>
                       <a:fillRect/>
                     </a:stretch>
@@ -206,65 +718,21 @@
           <w:numId w:val="1"/>
         </w:numPr>
       </w:pPr>
-      <w:proofErr w:type="spellStart"/>
-      <w:r>
-        <w:t>Memastikan</w:t>
-      </w:r>
-      <w:proofErr w:type="spellEnd"/>
-      <w:r>
-        <w:t xml:space="preserve"> services </w:t>
-      </w:r>
-      <w:proofErr w:type="spellStart"/>
-      <w:r>
-        <w:t>mysql</w:t>
-      </w:r>
-      <w:proofErr w:type="spellEnd"/>
-      <w:r>
-        <w:t xml:space="preserve"> </w:t>
-      </w:r>
-      <w:proofErr w:type="spellStart"/>
-      <w:r>
-        <w:t>sudah</w:t>
-      </w:r>
-      <w:proofErr w:type="spellEnd"/>
-      <w:r>
-        <w:t xml:space="preserve"> </w:t>
-      </w:r>
-      <w:proofErr w:type="spellStart"/>
-      <w:r>
-        <w:t>berjalan</w:t>
-      </w:r>
-      <w:proofErr w:type="spellEnd"/>
-      <w:r>
-        <w:t xml:space="preserve"> =&gt; </w:t>
-      </w:r>
-      <w:proofErr w:type="spellStart"/>
-      <w:r>
-        <w:t>sudo</w:t>
-      </w:r>
-      <w:proofErr w:type="spellEnd"/>
-      <w:r>
-        <w:t xml:space="preserve"> </w:t>
-      </w:r>
-      <w:proofErr w:type="spellStart"/>
-      <w:r>
-        <w:t>systemctl</w:t>
-      </w:r>
-      <w:proofErr w:type="spellEnd"/>
-      <w:r>
-        <w:t xml:space="preserve"> status </w:t>
-      </w:r>
-      <w:proofErr w:type="spellStart"/>
-      <w:r>
-        <w:t>mysql</w:t>
-      </w:r>
-      <w:proofErr w:type="spellEnd"/>
-    </w:p>
-    <w:p>
-      <w:pPr>
-        <w:jc w:val="center"/>
-      </w:pPr>
-      <w:r>
+      <w:r>
+        <w:t xml:space="preserve">Memastikan services mysql sudah berjalan =&gt; </w:t>
+      </w:r>
+      <w:r>
+        <w:t>sudo systemctl status mysql</w:t>
+      </w:r>
+    </w:p>
+    <w:p>
+      <w:pPr>
+        <w:jc w:val="center"/>
+      </w:pPr>
+      <w:r>
+        <w:rPr>
+          <w:noProof/>
+        </w:rPr>
         <w:drawing>
           <wp:inline distT="0" distB="0" distL="0" distR="0" wp14:anchorId="2F369DB3" wp14:editId="528D6F7B">
             <wp:extent cx="4800600" cy="2368501"/>
@@ -281,7 +749,7 @@
                     <pic:cNvPicPr/>
                   </pic:nvPicPr>
                   <pic:blipFill>
-                    <a:blip r:embed="rId7"/>
+                    <a:blip r:embed="rId16"/>
                     <a:stretch>
                       <a:fillRect/>
                     </a:stretch>
@@ -317,51 +785,17 @@
       </w:pPr>
       <w:r>
         <w:lastRenderedPageBreak/>
-        <w:t xml:space="preserve">Masuk </w:t>
-      </w:r>
-      <w:proofErr w:type="spellStart"/>
-      <w:r>
-        <w:t>ke</w:t>
-      </w:r>
-      <w:proofErr w:type="spellEnd"/>
-      <w:r>
-        <w:t xml:space="preserve"> </w:t>
-      </w:r>
-      <w:proofErr w:type="spellStart"/>
-      <w:r>
-        <w:t>dalam</w:t>
-      </w:r>
-      <w:proofErr w:type="spellEnd"/>
-      <w:r>
-        <w:t xml:space="preserve"> </w:t>
-      </w:r>
-      <w:proofErr w:type="spellStart"/>
-      <w:r>
-        <w:t>sistem</w:t>
-      </w:r>
-      <w:proofErr w:type="spellEnd"/>
-      <w:r>
-        <w:t xml:space="preserve"> database =&gt; </w:t>
-      </w:r>
-      <w:proofErr w:type="spellStart"/>
-      <w:r>
-        <w:t>sudo</w:t>
-      </w:r>
-      <w:proofErr w:type="spellEnd"/>
-      <w:r>
-        <w:t xml:space="preserve"> </w:t>
-      </w:r>
-      <w:proofErr w:type="spellStart"/>
-      <w:r>
-        <w:t>mysql</w:t>
-      </w:r>
-      <w:proofErr w:type="spellEnd"/>
-    </w:p>
-    <w:p>
-      <w:pPr>
-        <w:jc w:val="center"/>
-      </w:pPr>
-      <w:r>
+        <w:t>Masuk ke dalam sistem database =&gt; sudo mysql</w:t>
+      </w:r>
+    </w:p>
+    <w:p>
+      <w:pPr>
+        <w:jc w:val="center"/>
+      </w:pPr>
+      <w:r>
+        <w:rPr>
+          <w:noProof/>
+        </w:rPr>
         <w:drawing>
           <wp:inline distT="0" distB="0" distL="0" distR="0" wp14:anchorId="48D4E6D5" wp14:editId="3BCC000F">
             <wp:extent cx="4800600" cy="1833865"/>
@@ -378,7 +812,7 @@
                     <pic:cNvPicPr/>
                   </pic:nvPicPr>
                   <pic:blipFill>
-                    <a:blip r:embed="rId8"/>
+                    <a:blip r:embed="rId17"/>
                     <a:stretch>
                       <a:fillRect/>
                     </a:stretch>
@@ -423,73 +857,21 @@
           <w:numId w:val="3"/>
         </w:numPr>
       </w:pPr>
-      <w:proofErr w:type="spellStart"/>
-      <w:r>
-        <w:t>Membuka</w:t>
-      </w:r>
-      <w:proofErr w:type="spellEnd"/>
-      <w:r>
-        <w:t xml:space="preserve"> Nano </w:t>
-      </w:r>
-      <w:proofErr w:type="spellStart"/>
-      <w:r>
-        <w:t>untuk</w:t>
-      </w:r>
-      <w:proofErr w:type="spellEnd"/>
-      <w:r>
-        <w:t xml:space="preserve"> edit file </w:t>
-      </w:r>
-      <w:proofErr w:type="spellStart"/>
-      <w:r>
-        <w:t>konfigurasi</w:t>
-      </w:r>
-      <w:proofErr w:type="spellEnd"/>
-      <w:r>
-        <w:t xml:space="preserve"> =&gt; </w:t>
-      </w:r>
-      <w:proofErr w:type="spellStart"/>
-      <w:r>
-        <w:t>sudo</w:t>
-      </w:r>
-      <w:proofErr w:type="spellEnd"/>
-      <w:r>
-        <w:t xml:space="preserve"> nano /</w:t>
-      </w:r>
-      <w:proofErr w:type="spellStart"/>
-      <w:r>
-        <w:t>etc</w:t>
-      </w:r>
-      <w:proofErr w:type="spellEnd"/>
-      <w:r>
-        <w:t>/</w:t>
-      </w:r>
-      <w:proofErr w:type="spellStart"/>
-      <w:r>
-        <w:t>mysql</w:t>
-      </w:r>
-      <w:proofErr w:type="spellEnd"/>
-      <w:r>
-        <w:t>/</w:t>
-      </w:r>
-      <w:proofErr w:type="spellStart"/>
-      <w:r>
-        <w:t>mysql.conf.d</w:t>
-      </w:r>
-      <w:proofErr w:type="spellEnd"/>
-      <w:r>
-        <w:t>/</w:t>
-      </w:r>
-      <w:proofErr w:type="spellStart"/>
-      <w:r>
-        <w:t>mysqld.cnf</w:t>
-      </w:r>
-      <w:proofErr w:type="spellEnd"/>
-    </w:p>
-    <w:p>
-      <w:pPr>
-        <w:jc w:val="center"/>
-      </w:pPr>
-      <w:r>
+      <w:r>
+        <w:t xml:space="preserve">Membuka Nano untuk edit file konfigurasi =&gt; </w:t>
+      </w:r>
+      <w:r>
+        <w:t>sudo nano /etc/mysql/mysql.conf.d/mysqld.cnf</w:t>
+      </w:r>
+    </w:p>
+    <w:p>
+      <w:pPr>
+        <w:jc w:val="center"/>
+      </w:pPr>
+      <w:r>
+        <w:rPr>
+          <w:noProof/>
+        </w:rPr>
         <w:drawing>
           <wp:inline distT="0" distB="0" distL="0" distR="0" wp14:anchorId="674297C2" wp14:editId="46352037">
             <wp:extent cx="4695825" cy="2128885"/>
@@ -506,7 +888,7 @@
                     <pic:cNvPicPr/>
                   </pic:nvPicPr>
                   <pic:blipFill>
-                    <a:blip r:embed="rId9"/>
+                    <a:blip r:embed="rId18"/>
                     <a:stretch>
                       <a:fillRect/>
                     </a:stretch>
@@ -538,49 +920,21 @@
       <w:r>
         <w:t xml:space="preserve">Restart service </w:t>
       </w:r>
-      <w:proofErr w:type="spellStart"/>
-      <w:r>
-        <w:t>mysql</w:t>
-      </w:r>
-      <w:proofErr w:type="spellEnd"/>
-      <w:r>
-        <w:t xml:space="preserve"> di </w:t>
-      </w:r>
-      <w:proofErr w:type="spellStart"/>
-      <w:r>
-        <w:t>vps</w:t>
-      </w:r>
-      <w:proofErr w:type="spellEnd"/>
-      <w:r>
-        <w:t xml:space="preserve"> =&gt; </w:t>
-      </w:r>
-      <w:proofErr w:type="spellStart"/>
-      <w:r>
-        <w:t>sudo</w:t>
-      </w:r>
-      <w:proofErr w:type="spellEnd"/>
-      <w:r>
-        <w:t xml:space="preserve"> </w:t>
-      </w:r>
-      <w:proofErr w:type="spellStart"/>
-      <w:r>
-        <w:t>systemctl</w:t>
-      </w:r>
-      <w:proofErr w:type="spellEnd"/>
-      <w:r>
-        <w:t xml:space="preserve"> restart </w:t>
-      </w:r>
-      <w:proofErr w:type="spellStart"/>
-      <w:r>
-        <w:t>mysql</w:t>
-      </w:r>
-      <w:proofErr w:type="spellEnd"/>
-    </w:p>
-    <w:p>
-      <w:pPr>
-        <w:jc w:val="center"/>
-      </w:pPr>
-      <w:r>
+      <w:r>
+        <w:t xml:space="preserve">mysql di vps =&gt; </w:t>
+      </w:r>
+      <w:r>
+        <w:t>sudo systemctl restart mysql</w:t>
+      </w:r>
+    </w:p>
+    <w:p>
+      <w:pPr>
+        <w:jc w:val="center"/>
+      </w:pPr>
+      <w:r>
+        <w:rPr>
+          <w:noProof/>
+        </w:rPr>
         <w:drawing>
           <wp:inline distT="0" distB="0" distL="0" distR="0" wp14:anchorId="0124B35F" wp14:editId="1D2203AD">
             <wp:extent cx="4752975" cy="1440742"/>
@@ -597,7 +951,7 @@
                     <pic:cNvPicPr/>
                   </pic:nvPicPr>
                   <pic:blipFill>
-                    <a:blip r:embed="rId10"/>
+                    <a:blip r:embed="rId19"/>
                     <a:stretch>
                       <a:fillRect/>
                     </a:stretch>
@@ -627,55 +981,10 @@
         </w:numPr>
       </w:pPr>
       <w:r>
-        <w:t xml:space="preserve">Masuk </w:t>
-      </w:r>
-      <w:proofErr w:type="spellStart"/>
-      <w:r>
-        <w:t>ke</w:t>
-      </w:r>
-      <w:proofErr w:type="spellEnd"/>
-      <w:r>
-        <w:t xml:space="preserve"> </w:t>
-      </w:r>
-      <w:proofErr w:type="spellStart"/>
-      <w:r>
-        <w:t>sistem</w:t>
-      </w:r>
-      <w:proofErr w:type="spellEnd"/>
-      <w:r>
-        <w:t xml:space="preserve"> </w:t>
-      </w:r>
-      <w:proofErr w:type="spellStart"/>
-      <w:r>
-        <w:t>mysql</w:t>
-      </w:r>
-      <w:proofErr w:type="spellEnd"/>
-      <w:r>
-        <w:t xml:space="preserve"> </w:t>
-      </w:r>
-      <w:proofErr w:type="spellStart"/>
-      <w:r>
-        <w:t>sebagai</w:t>
-      </w:r>
-      <w:proofErr w:type="spellEnd"/>
-      <w:r>
-        <w:t xml:space="preserve"> root =&gt; </w:t>
-      </w:r>
-      <w:proofErr w:type="spellStart"/>
-      <w:r>
-        <w:t>sudo</w:t>
-      </w:r>
-      <w:proofErr w:type="spellEnd"/>
-      <w:r>
-        <w:t xml:space="preserve"> </w:t>
-      </w:r>
-      <w:proofErr w:type="spellStart"/>
-      <w:r>
-        <w:t>mysql</w:t>
-      </w:r>
-      <w:proofErr w:type="spellEnd"/>
-      <w:r>
-        <w:t xml:space="preserve"> -u root -p</w:t>
+        <w:t xml:space="preserve">Masuk ke sistem mysql sebagai root =&gt; </w:t>
+      </w:r>
+      <w:r>
+        <w:t>sudo mysql -u root -p</w:t>
       </w:r>
     </w:p>
     <w:p>
@@ -690,6 +999,9 @@
         <w:jc w:val="center"/>
       </w:pPr>
       <w:r>
+        <w:rPr>
+          <w:noProof/>
+        </w:rPr>
         <w:drawing>
           <wp:inline distT="0" distB="0" distL="0" distR="0" wp14:anchorId="37821ACF" wp14:editId="29E45033">
             <wp:extent cx="4810125" cy="1854024"/>
@@ -706,7 +1018,7 @@
                     <pic:cNvPicPr/>
                   </pic:nvPicPr>
                   <pic:blipFill>
-                    <a:blip r:embed="rId11"/>
+                    <a:blip r:embed="rId20"/>
                     <a:stretch>
                       <a:fillRect/>
                     </a:stretch>
@@ -741,36 +1053,16 @@
           <w:numId w:val="3"/>
         </w:numPr>
       </w:pPr>
-      <w:proofErr w:type="spellStart"/>
       <w:r>
         <w:lastRenderedPageBreak/>
-        <w:t>Membuat</w:t>
-      </w:r>
-      <w:proofErr w:type="spellEnd"/>
-      <w:r>
-        <w:t xml:space="preserve"> </w:t>
-      </w:r>
-      <w:proofErr w:type="spellStart"/>
-      <w:r>
-        <w:t>pengguna</w:t>
-      </w:r>
-      <w:proofErr w:type="spellEnd"/>
-      <w:r>
-        <w:t xml:space="preserve"> Baru =&gt; </w:t>
-      </w:r>
-      <w:proofErr w:type="spellStart"/>
-      <w:r>
-        <w:t>mysql</w:t>
-      </w:r>
-      <w:proofErr w:type="spellEnd"/>
-      <w:r>
-        <w:t>&gt; CREATE USER '</w:t>
-      </w:r>
-      <w:proofErr w:type="spellStart"/>
+        <w:t xml:space="preserve">Membuat pengguna Baru =&gt; </w:t>
+      </w:r>
+      <w:r>
+        <w:t>mysql&gt; CREATE USER '</w:t>
+      </w:r>
       <w:r>
         <w:t>illyas</w:t>
       </w:r>
-      <w:proofErr w:type="spellEnd"/>
       <w:r>
         <w:t>'@'%' IDENTIFIED BY '</w:t>
       </w:r>
@@ -786,6 +1078,9 @@
         <w:jc w:val="center"/>
       </w:pPr>
       <w:r>
+        <w:rPr>
+          <w:noProof/>
+        </w:rPr>
         <w:drawing>
           <wp:inline distT="0" distB="0" distL="0" distR="0" wp14:anchorId="538C9119" wp14:editId="25490649">
             <wp:extent cx="4781550" cy="728846"/>
@@ -802,7 +1097,7 @@
                     <pic:cNvPicPr/>
                   </pic:nvPicPr>
                   <pic:blipFill>
-                    <a:blip r:embed="rId12"/>
+                    <a:blip r:embed="rId21"/>
                     <a:stretch>
                       <a:fillRect/>
                     </a:stretch>
@@ -831,61 +1126,11 @@
           <w:numId w:val="3"/>
         </w:numPr>
       </w:pPr>
-      <w:proofErr w:type="spellStart"/>
-      <w:r>
-        <w:t>Memberikan</w:t>
-      </w:r>
-      <w:proofErr w:type="spellEnd"/>
-      <w:r>
-        <w:t xml:space="preserve"> </w:t>
-      </w:r>
-      <w:proofErr w:type="spellStart"/>
-      <w:r>
-        <w:t>akses</w:t>
-      </w:r>
-      <w:proofErr w:type="spellEnd"/>
-      <w:r>
-        <w:t xml:space="preserve"> </w:t>
-      </w:r>
-      <w:proofErr w:type="spellStart"/>
-      <w:r>
-        <w:t>kepada</w:t>
-      </w:r>
-      <w:proofErr w:type="spellEnd"/>
-      <w:r>
-        <w:t xml:space="preserve"> </w:t>
-      </w:r>
-      <w:proofErr w:type="spellStart"/>
-      <w:r>
-        <w:t>pengguna</w:t>
-      </w:r>
-      <w:proofErr w:type="spellEnd"/>
-      <w:r>
-        <w:t xml:space="preserve"> </w:t>
-      </w:r>
-      <w:proofErr w:type="spellStart"/>
-      <w:r>
-        <w:t>baru</w:t>
-      </w:r>
-      <w:proofErr w:type="spellEnd"/>
-      <w:r>
-        <w:t xml:space="preserve"> =&gt; GRANT ALL PRIVILEGES ON </w:t>
-      </w:r>
-      <w:proofErr w:type="gramStart"/>
-      <w:r>
-        <w:t>*.*</w:t>
-      </w:r>
-      <w:proofErr w:type="gramEnd"/>
-      <w:r>
-        <w:t xml:space="preserve"> TO ‘</w:t>
-      </w:r>
-      <w:proofErr w:type="spellStart"/>
-      <w:r>
-        <w:t>illyas</w:t>
-      </w:r>
-      <w:proofErr w:type="spellEnd"/>
-      <w:r>
-        <w:t>’@’%’;</w:t>
+      <w:r>
+        <w:t>Memberikan akses kepada pengguna baru</w:t>
+      </w:r>
+      <w:r>
+        <w:t xml:space="preserve"> =&gt; GRANT ALL PRIVILEGES ON *.* TO ‘illyas’@’%’;</w:t>
       </w:r>
     </w:p>
     <w:p>
@@ -894,6 +1139,9 @@
         <w:jc w:val="center"/>
       </w:pPr>
       <w:r>
+        <w:rPr>
+          <w:noProof/>
+        </w:rPr>
         <w:drawing>
           <wp:inline distT="0" distB="0" distL="0" distR="0" wp14:anchorId="338BF810" wp14:editId="63A3630B">
             <wp:extent cx="4895850" cy="742629"/>
@@ -910,7 +1158,7 @@
                     <pic:cNvPicPr/>
                   </pic:nvPicPr>
                   <pic:blipFill>
-                    <a:blip r:embed="rId13"/>
+                    <a:blip r:embed="rId22"/>
                     <a:stretch>
                       <a:fillRect/>
                     </a:stretch>
@@ -940,47 +1188,7 @@
         </w:numPr>
       </w:pPr>
       <w:r>
-        <w:t xml:space="preserve">Refresh </w:t>
-      </w:r>
-      <w:proofErr w:type="spellStart"/>
-      <w:r>
-        <w:t>hak</w:t>
-      </w:r>
-      <w:proofErr w:type="spellEnd"/>
-      <w:r>
-        <w:t xml:space="preserve"> </w:t>
-      </w:r>
-      <w:proofErr w:type="spellStart"/>
-      <w:r>
-        <w:t>akses</w:t>
-      </w:r>
-      <w:proofErr w:type="spellEnd"/>
-      <w:r>
-        <w:t xml:space="preserve"> </w:t>
-      </w:r>
-      <w:proofErr w:type="spellStart"/>
-      <w:r>
-        <w:t>kepada</w:t>
-      </w:r>
-      <w:proofErr w:type="spellEnd"/>
-      <w:r>
-        <w:t xml:space="preserve"> </w:t>
-      </w:r>
-      <w:proofErr w:type="spellStart"/>
-      <w:r>
-        <w:t>pengguna</w:t>
-      </w:r>
-      <w:proofErr w:type="spellEnd"/>
-      <w:r>
-        <w:t xml:space="preserve"> </w:t>
-      </w:r>
-      <w:proofErr w:type="spellStart"/>
-      <w:r>
-        <w:t>tanpa</w:t>
-      </w:r>
-      <w:proofErr w:type="spellEnd"/>
-      <w:r>
-        <w:t xml:space="preserve"> restart database =&gt; </w:t>
+        <w:t xml:space="preserve">Refresh hak akses kepada pengguna tanpa restart database =&gt; </w:t>
       </w:r>
       <w:r>
         <w:t>FLUSH PRIVILEGES;</w:t>
@@ -992,6 +1200,9 @@
         <w:jc w:val="center"/>
       </w:pPr>
       <w:r>
+        <w:rPr>
+          <w:noProof/>
+        </w:rPr>
         <w:drawing>
           <wp:inline distT="0" distB="0" distL="0" distR="0" wp14:anchorId="59C56DD7" wp14:editId="0613C852">
             <wp:extent cx="3781953" cy="743054"/>
@@ -1008,7 +1219,7 @@
                     <pic:cNvPicPr/>
                   </pic:nvPicPr>
                   <pic:blipFill>
-                    <a:blip r:embed="rId14"/>
+                    <a:blip r:embed="rId23"/>
                     <a:stretch>
                       <a:fillRect/>
                     </a:stretch>
@@ -1037,37 +1248,8 @@
           <w:numId w:val="3"/>
         </w:numPr>
       </w:pPr>
-      <w:proofErr w:type="spellStart"/>
-      <w:r>
-        <w:t>Keluar</w:t>
-      </w:r>
-      <w:proofErr w:type="spellEnd"/>
-      <w:r>
-        <w:t xml:space="preserve"> </w:t>
-      </w:r>
-      <w:proofErr w:type="spellStart"/>
-      <w:r>
-        <w:t>dari</w:t>
-      </w:r>
-      <w:proofErr w:type="spellEnd"/>
-      <w:r>
-        <w:t xml:space="preserve"> </w:t>
-      </w:r>
-      <w:proofErr w:type="spellStart"/>
-      <w:r>
-        <w:t>sistem</w:t>
-      </w:r>
-      <w:proofErr w:type="spellEnd"/>
-      <w:r>
-        <w:t xml:space="preserve"> </w:t>
-      </w:r>
-      <w:proofErr w:type="spellStart"/>
-      <w:r>
-        <w:t>mysql</w:t>
-      </w:r>
-      <w:proofErr w:type="spellEnd"/>
-      <w:r>
-        <w:t xml:space="preserve"> =&gt; EXIT;</w:t>
+      <w:r>
+        <w:t>Keluar dari sistem mysql =&gt; EXIT;</w:t>
       </w:r>
     </w:p>
     <w:p>
@@ -1076,6 +1258,9 @@
         <w:jc w:val="center"/>
       </w:pPr>
       <w:r>
+        <w:rPr>
+          <w:noProof/>
+        </w:rPr>
         <w:drawing>
           <wp:inline distT="0" distB="0" distL="0" distR="0" wp14:anchorId="714A7CE0" wp14:editId="51A58A3F">
             <wp:extent cx="3267531" cy="581106"/>
@@ -1092,7 +1277,7 @@
                     <pic:cNvPicPr/>
                   </pic:nvPicPr>
                   <pic:blipFill>
-                    <a:blip r:embed="rId15"/>
+                    <a:blip r:embed="rId24"/>
                     <a:stretch>
                       <a:fillRect/>
                     </a:stretch>
@@ -1121,49 +1306,21 @@
           <w:numId w:val="3"/>
         </w:numPr>
       </w:pPr>
-      <w:proofErr w:type="spellStart"/>
-      <w:r>
-        <w:t>Membuka</w:t>
-      </w:r>
-      <w:proofErr w:type="spellEnd"/>
-      <w:r>
-        <w:t xml:space="preserve"> port 3306 di firewall </w:t>
-      </w:r>
-      <w:proofErr w:type="spellStart"/>
-      <w:r>
-        <w:t>vps</w:t>
-      </w:r>
-      <w:proofErr w:type="spellEnd"/>
-      <w:r>
-        <w:t xml:space="preserve"> =&gt; </w:t>
-      </w:r>
-      <w:proofErr w:type="spellStart"/>
-      <w:r>
-        <w:t>sudo</w:t>
-      </w:r>
-      <w:proofErr w:type="spellEnd"/>
-      <w:r>
-        <w:t xml:space="preserve"> </w:t>
-      </w:r>
-      <w:proofErr w:type="spellStart"/>
-      <w:r>
-        <w:t>ufw</w:t>
-      </w:r>
-      <w:proofErr w:type="spellEnd"/>
-      <w:r>
-        <w:t xml:space="preserve"> allow 3306/</w:t>
-      </w:r>
-      <w:proofErr w:type="spellStart"/>
-      <w:r>
-        <w:t>tcp</w:t>
-      </w:r>
-      <w:proofErr w:type="spellEnd"/>
-    </w:p>
-    <w:p>
-      <w:pPr>
-        <w:jc w:val="center"/>
-      </w:pPr>
-      <w:r>
+      <w:r>
+        <w:t xml:space="preserve">Membuka port 3306 di firewall vps =&gt; </w:t>
+      </w:r>
+      <w:r>
+        <w:t>sudo ufw allow 3306/tcp</w:t>
+      </w:r>
+    </w:p>
+    <w:p>
+      <w:pPr>
+        <w:jc w:val="center"/>
+      </w:pPr>
+      <w:r>
+        <w:rPr>
+          <w:noProof/>
+        </w:rPr>
         <w:drawing>
           <wp:inline distT="0" distB="0" distL="0" distR="0" wp14:anchorId="56D1E404" wp14:editId="4D25574A">
             <wp:extent cx="4420217" cy="724001"/>
@@ -1180,7 +1337,7 @@
                     <pic:cNvPicPr/>
                   </pic:nvPicPr>
                   <pic:blipFill>
-                    <a:blip r:embed="rId16"/>
+                    <a:blip r:embed="rId25"/>
                     <a:stretch>
                       <a:fillRect/>
                     </a:stretch>
@@ -1233,6 +1390,7 @@
         <w:rPr>
           <w:b/>
           <w:bCs/>
+          <w:noProof/>
         </w:rPr>
         <w:drawing>
           <wp:inline distT="0" distB="0" distL="0" distR="0" wp14:anchorId="418264A0" wp14:editId="56707D4D">
@@ -1250,7 +1408,7 @@
                     <pic:cNvPicPr/>
                   </pic:nvPicPr>
                   <pic:blipFill>
-                    <a:blip r:embed="rId17"/>
+                    <a:blip r:embed="rId26"/>
                     <a:stretch>
                       <a:fillRect/>
                     </a:stretch>
@@ -1300,45 +1458,16 @@
           <w:bCs/>
         </w:rPr>
       </w:pPr>
-      <w:proofErr w:type="spellStart"/>
-      <w:r>
-        <w:t>Membuat</w:t>
-      </w:r>
-      <w:proofErr w:type="spellEnd"/>
-      <w:r>
-        <w:t xml:space="preserve"> database di </w:t>
-      </w:r>
-      <w:proofErr w:type="spellStart"/>
-      <w:r>
-        <w:t>mysql</w:t>
-      </w:r>
-      <w:proofErr w:type="spellEnd"/>
-      <w:r>
-        <w:t xml:space="preserve"> workbench=</w:t>
-      </w:r>
-      <w:proofErr w:type="gramStart"/>
-      <w:r>
-        <w:t>&gt;  CREATE</w:t>
-      </w:r>
-      <w:proofErr w:type="gramEnd"/>
-      <w:r>
-        <w:t xml:space="preserve"> DATABASE TEST_KONEKSI;</w:t>
-      </w:r>
-    </w:p>
-    <w:p>
-      <w:pPr>
-        <w:pStyle w:val="ListParagraph"/>
-      </w:pPr>
-      <w:r>
-        <w:t xml:space="preserve">Dan </w:t>
-      </w:r>
-      <w:proofErr w:type="spellStart"/>
-      <w:r>
-        <w:t>menampilkan</w:t>
-      </w:r>
-      <w:proofErr w:type="spellEnd"/>
-      <w:r>
-        <w:t xml:space="preserve"> database =&gt; SHOW DATABASES;</w:t>
+      <w:r>
+        <w:t>Membuat database di mysql workbench=&gt;  CREATE DATABASE TEST_KONEKSI;</w:t>
+      </w:r>
+    </w:p>
+    <w:p>
+      <w:pPr>
+        <w:pStyle w:val="ListParagraph"/>
+      </w:pPr>
+      <w:r>
+        <w:t>Dan menampilkan database =&gt; SHOW DATABASES;</w:t>
       </w:r>
     </w:p>
     <w:p>
@@ -1360,6 +1489,7 @@
         <w:rPr>
           <w:b/>
           <w:bCs/>
+          <w:noProof/>
         </w:rPr>
         <w:drawing>
           <wp:inline distT="0" distB="0" distL="0" distR="0" wp14:anchorId="71AF0A88" wp14:editId="620B6369">
@@ -1377,7 +1507,7 @@
                     <pic:cNvPicPr/>
                   </pic:nvPicPr>
                   <pic:blipFill>
-                    <a:blip r:embed="rId18"/>
+                    <a:blip r:embed="rId27"/>
                     <a:stretch>
                       <a:fillRect/>
                     </a:stretch>
@@ -1417,103 +1547,40 @@
           <w:numId w:val="4"/>
         </w:numPr>
       </w:pPr>
-      <w:proofErr w:type="spellStart"/>
-      <w:r>
-        <w:t>Menguji</w:t>
-      </w:r>
-      <w:proofErr w:type="spellEnd"/>
-      <w:r>
-        <w:t xml:space="preserve"> di VPS </w:t>
-      </w:r>
-      <w:proofErr w:type="spellStart"/>
-      <w:r>
-        <w:t>dengan</w:t>
-      </w:r>
-      <w:proofErr w:type="spellEnd"/>
-      <w:r>
-        <w:t xml:space="preserve"> </w:t>
-      </w:r>
-      <w:proofErr w:type="spellStart"/>
-      <w:r>
-        <w:t>mencoba</w:t>
-      </w:r>
-      <w:proofErr w:type="spellEnd"/>
-      <w:r>
-        <w:t xml:space="preserve"> </w:t>
-      </w:r>
-      <w:proofErr w:type="spellStart"/>
-      <w:r>
-        <w:t>menampilkan</w:t>
-      </w:r>
-      <w:proofErr w:type="spellEnd"/>
-      <w:r>
-        <w:t xml:space="preserve"> database</w:t>
-      </w:r>
-    </w:p>
-    <w:p>
-      <w:pPr>
-        <w:pStyle w:val="ListParagraph"/>
-      </w:pPr>
-      <w:r>
-        <w:t xml:space="preserve">Masuk </w:t>
-      </w:r>
-      <w:proofErr w:type="spellStart"/>
-      <w:r>
-        <w:t>ke</w:t>
-      </w:r>
-      <w:proofErr w:type="spellEnd"/>
-      <w:r>
-        <w:t xml:space="preserve"> database root =&gt; </w:t>
-      </w:r>
-      <w:proofErr w:type="spellStart"/>
-      <w:r>
-        <w:t>sudo</w:t>
-      </w:r>
-      <w:proofErr w:type="spellEnd"/>
-      <w:r>
-        <w:t xml:space="preserve"> </w:t>
-      </w:r>
-      <w:proofErr w:type="spellStart"/>
-      <w:r>
-        <w:t>mysql</w:t>
-      </w:r>
-      <w:proofErr w:type="spellEnd"/>
-      <w:r>
-        <w:t xml:space="preserve"> -u root -p</w:t>
-      </w:r>
-    </w:p>
-    <w:p>
-      <w:pPr>
-        <w:pStyle w:val="ListParagraph"/>
-      </w:pPr>
-      <w:proofErr w:type="spellStart"/>
-      <w:r>
-        <w:t>Menampilkan</w:t>
-      </w:r>
-      <w:proofErr w:type="spellEnd"/>
-      <w:r>
-        <w:t xml:space="preserve"> database =&gt; </w:t>
-      </w:r>
-      <w:proofErr w:type="spellStart"/>
-      <w:r>
-        <w:t>mysql</w:t>
-      </w:r>
-      <w:proofErr w:type="spellEnd"/>
-      <w:r>
-        <w:t xml:space="preserve"> &gt; show database;</w:t>
-      </w:r>
-    </w:p>
-    <w:p>
-      <w:pPr>
-        <w:pStyle w:val="ListParagraph"/>
-      </w:pPr>
-    </w:p>
-    <w:p>
-      <w:pPr>
-        <w:pStyle w:val="ListParagraph"/>
-        <w:jc w:val="center"/>
-      </w:pPr>
-      <w:r>
+      <w:r>
+        <w:t>Menguji di VPS dengan mencoba menampilkan database</w:t>
+      </w:r>
+    </w:p>
+    <w:p>
+      <w:pPr>
+        <w:pStyle w:val="ListParagraph"/>
+      </w:pPr>
+      <w:r>
+        <w:t>Masuk ke database root =&gt; sudo mysql -u root -p</w:t>
+      </w:r>
+    </w:p>
+    <w:p>
+      <w:pPr>
+        <w:pStyle w:val="ListParagraph"/>
+      </w:pPr>
+      <w:r>
+        <w:t>Menampilkan database =&gt; mysql &gt; show database;</w:t>
+      </w:r>
+    </w:p>
+    <w:p>
+      <w:pPr>
+        <w:pStyle w:val="ListParagraph"/>
+      </w:pPr>
+    </w:p>
+    <w:p>
+      <w:pPr>
+        <w:pStyle w:val="ListParagraph"/>
+        <w:jc w:val="center"/>
+      </w:pPr>
+      <w:r>
+        <w:rPr>
+          <w:noProof/>
+        </w:rPr>
         <w:drawing>
           <wp:inline distT="0" distB="0" distL="0" distR="0" wp14:anchorId="25B79B25" wp14:editId="3DC19187">
             <wp:extent cx="5591175" cy="4211655"/>
@@ -1530,7 +1597,7 @@
                     <pic:cNvPicPr/>
                   </pic:nvPicPr>
                   <pic:blipFill>
-                    <a:blip r:embed="rId19"/>
+                    <a:blip r:embed="rId28"/>
                     <a:stretch>
                       <a:fillRect/>
                     </a:stretch>
@@ -1560,65 +1627,8 @@
         </w:rPr>
       </w:pPr>
       <w:r>
-        <w:t xml:space="preserve">Di </w:t>
-      </w:r>
-      <w:proofErr w:type="spellStart"/>
-      <w:r>
-        <w:t>dalam</w:t>
-      </w:r>
-      <w:proofErr w:type="spellEnd"/>
-      <w:r>
-        <w:t xml:space="preserve"> </w:t>
-      </w:r>
-      <w:proofErr w:type="spellStart"/>
-      <w:r>
-        <w:t>mysql</w:t>
-      </w:r>
-      <w:proofErr w:type="spellEnd"/>
-      <w:r>
-        <w:t xml:space="preserve"> </w:t>
-      </w:r>
-      <w:proofErr w:type="spellStart"/>
-      <w:r>
-        <w:t>terdapat</w:t>
-      </w:r>
-      <w:proofErr w:type="spellEnd"/>
-      <w:r>
-        <w:t xml:space="preserve"> database yang </w:t>
-      </w:r>
-      <w:proofErr w:type="spellStart"/>
-      <w:r>
-        <w:t>tadi</w:t>
-      </w:r>
-      <w:proofErr w:type="spellEnd"/>
-      <w:r>
-        <w:t xml:space="preserve"> </w:t>
-      </w:r>
-      <w:proofErr w:type="spellStart"/>
-      <w:r>
-        <w:t>dibuat</w:t>
-      </w:r>
-      <w:proofErr w:type="spellEnd"/>
-      <w:r>
-        <w:t xml:space="preserve"> di </w:t>
-      </w:r>
-      <w:proofErr w:type="spellStart"/>
-      <w:r>
-        <w:t>mysql</w:t>
-      </w:r>
-      <w:proofErr w:type="spellEnd"/>
-      <w:r>
-        <w:t xml:space="preserve"> workbench </w:t>
-      </w:r>
-      <w:proofErr w:type="spellStart"/>
-      <w:r>
-        <w:t>yaitu</w:t>
-      </w:r>
-      <w:proofErr w:type="spellEnd"/>
-      <w:r>
-        <w:t xml:space="preserve"> </w:t>
-      </w:r>
-      <w:proofErr w:type="spellStart"/>
+        <w:t xml:space="preserve">Di dalam mysql terdapat database yang tadi dibuat di mysql workbench yaitu </w:t>
+      </w:r>
       <w:r>
         <w:rPr>
           <w:b/>
@@ -1626,7 +1636,6 @@
         </w:rPr>
         <w:t>test_koneksi</w:t>
       </w:r>
-      <w:proofErr w:type="spellEnd"/>
     </w:p>
     <w:p>
       <w:pPr>
@@ -1693,6 +1702,7 @@
         <w:rPr>
           <w:b/>
           <w:bCs/>
+          <w:noProof/>
         </w:rPr>
         <w:drawing>
           <wp:inline distT="0" distB="0" distL="0" distR="0" wp14:anchorId="5802D2A8" wp14:editId="7F585E47">
@@ -1710,7 +1720,7 @@
                     <pic:cNvPicPr/>
                   </pic:nvPicPr>
                   <pic:blipFill>
-                    <a:blip r:embed="rId20"/>
+                    <a:blip r:embed="rId29"/>
                     <a:stretch>
                       <a:fillRect/>
                     </a:stretch>
@@ -1745,63 +1755,24 @@
       <w:pPr>
         <w:pStyle w:val="ListParagraph"/>
       </w:pPr>
-      <w:proofErr w:type="spellStart"/>
-      <w:r>
-        <w:t>Kemudian</w:t>
-      </w:r>
-      <w:proofErr w:type="spellEnd"/>
-      <w:r>
-        <w:t xml:space="preserve"> </w:t>
-      </w:r>
-      <w:proofErr w:type="spellStart"/>
-      <w:r>
-        <w:t>klik</w:t>
-      </w:r>
-      <w:proofErr w:type="spellEnd"/>
-      <w:r>
-        <w:t xml:space="preserve"> Open dan </w:t>
-      </w:r>
-      <w:proofErr w:type="spellStart"/>
-      <w:r>
-        <w:t>akan</w:t>
-      </w:r>
-      <w:proofErr w:type="spellEnd"/>
-      <w:r>
-        <w:t xml:space="preserve"> </w:t>
-      </w:r>
-      <w:proofErr w:type="spellStart"/>
-      <w:r>
-        <w:t>membuka</w:t>
-      </w:r>
-      <w:proofErr w:type="spellEnd"/>
-      <w:r>
-        <w:t xml:space="preserve"> terminal dan </w:t>
-      </w:r>
-      <w:proofErr w:type="spellStart"/>
-      <w:r>
-        <w:t>meminta</w:t>
-      </w:r>
-      <w:proofErr w:type="spellEnd"/>
-      <w:r>
-        <w:t xml:space="preserve"> password </w:t>
-      </w:r>
-      <w:proofErr w:type="spellStart"/>
-      <w:r>
-        <w:t>mysql</w:t>
-      </w:r>
-      <w:proofErr w:type="spellEnd"/>
-    </w:p>
-    <w:p>
-      <w:pPr>
-        <w:pStyle w:val="ListParagraph"/>
-      </w:pPr>
-    </w:p>
-    <w:p>
-      <w:pPr>
-        <w:pStyle w:val="ListParagraph"/>
-        <w:jc w:val="center"/>
-      </w:pPr>
-      <w:r>
+      <w:r>
+        <w:t>Kemudian klik Open dan akan membuka terminal dan meminta password mysql</w:t>
+      </w:r>
+    </w:p>
+    <w:p>
+      <w:pPr>
+        <w:pStyle w:val="ListParagraph"/>
+      </w:pPr>
+    </w:p>
+    <w:p>
+      <w:pPr>
+        <w:pStyle w:val="ListParagraph"/>
+        <w:jc w:val="center"/>
+      </w:pPr>
+      <w:r>
+        <w:rPr>
+          <w:noProof/>
+        </w:rPr>
         <w:drawing>
           <wp:inline distT="0" distB="0" distL="0" distR="0" wp14:anchorId="7EA34932" wp14:editId="447C1A43">
             <wp:extent cx="5486400" cy="3491456"/>
@@ -1818,7 +1789,7 @@
                     <pic:cNvPicPr/>
                   </pic:nvPicPr>
                   <pic:blipFill>
-                    <a:blip r:embed="rId21"/>
+                    <a:blip r:embed="rId30"/>
                     <a:stretch>
                       <a:fillRect/>
                     </a:stretch>
@@ -1853,72 +1824,25 @@
       <w:pPr>
         <w:pStyle w:val="ListParagraph"/>
       </w:pPr>
-      <w:proofErr w:type="spellStart"/>
       <w:r>
         <w:lastRenderedPageBreak/>
-        <w:t>Setelah</w:t>
-      </w:r>
-      <w:proofErr w:type="spellEnd"/>
-      <w:r>
-        <w:t xml:space="preserve"> </w:t>
-      </w:r>
-      <w:proofErr w:type="spellStart"/>
-      <w:r>
-        <w:t>memasukan</w:t>
-      </w:r>
-      <w:proofErr w:type="spellEnd"/>
-      <w:r>
-        <w:t xml:space="preserve"> password </w:t>
-      </w:r>
-      <w:proofErr w:type="spellStart"/>
-      <w:r>
-        <w:t>akan</w:t>
-      </w:r>
-      <w:proofErr w:type="spellEnd"/>
-      <w:r>
-        <w:t xml:space="preserve"> </w:t>
-      </w:r>
-      <w:proofErr w:type="spellStart"/>
-      <w:r>
-        <w:t>tampil</w:t>
-      </w:r>
-      <w:proofErr w:type="spellEnd"/>
-      <w:r>
-        <w:t xml:space="preserve"> </w:t>
-      </w:r>
-      <w:proofErr w:type="spellStart"/>
-      <w:r>
-        <w:t>seperti</w:t>
-      </w:r>
-      <w:proofErr w:type="spellEnd"/>
-      <w:r>
-        <w:t xml:space="preserve"> </w:t>
-      </w:r>
-      <w:proofErr w:type="spellStart"/>
-      <w:r>
-        <w:t>dibawah</w:t>
-      </w:r>
-      <w:proofErr w:type="spellEnd"/>
-      <w:r>
-        <w:t xml:space="preserve"> </w:t>
-      </w:r>
-      <w:proofErr w:type="spellStart"/>
-      <w:r>
-        <w:t>ini</w:t>
-      </w:r>
-      <w:proofErr w:type="spellEnd"/>
-    </w:p>
-    <w:p>
-      <w:pPr>
-        <w:pStyle w:val="ListParagraph"/>
-      </w:pPr>
-    </w:p>
-    <w:p>
-      <w:pPr>
-        <w:pStyle w:val="ListParagraph"/>
-        <w:jc w:val="center"/>
-      </w:pPr>
-      <w:r>
+        <w:t>Setelah memasukan password akan tampil seperti dibawah ini</w:t>
+      </w:r>
+    </w:p>
+    <w:p>
+      <w:pPr>
+        <w:pStyle w:val="ListParagraph"/>
+      </w:pPr>
+    </w:p>
+    <w:p>
+      <w:pPr>
+        <w:pStyle w:val="ListParagraph"/>
+        <w:jc w:val="center"/>
+      </w:pPr>
+      <w:r>
+        <w:rPr>
+          <w:noProof/>
+        </w:rPr>
         <w:drawing>
           <wp:inline distT="0" distB="0" distL="0" distR="0" wp14:anchorId="55686798" wp14:editId="6FB04C03">
             <wp:extent cx="4619625" cy="3926630"/>
@@ -1935,7 +1859,7 @@
                     <pic:cNvPicPr/>
                   </pic:nvPicPr>
                   <pic:blipFill>
-                    <a:blip r:embed="rId22"/>
+                    <a:blip r:embed="rId31"/>
                     <a:stretch>
                       <a:fillRect/>
                     </a:stretch>
@@ -1968,53 +1892,27 @@
         <w:jc w:val="center"/>
       </w:pPr>
       <w:r>
-        <w:t xml:space="preserve">Masuk </w:t>
-      </w:r>
-      <w:proofErr w:type="spellStart"/>
-      <w:r>
-        <w:t>ke</w:t>
-      </w:r>
-      <w:proofErr w:type="spellEnd"/>
-      <w:r>
-        <w:t xml:space="preserve"> root </w:t>
-      </w:r>
-      <w:proofErr w:type="spellStart"/>
-      <w:r>
-        <w:t>mysql</w:t>
-      </w:r>
-      <w:proofErr w:type="spellEnd"/>
-      <w:r>
-        <w:t xml:space="preserve"> =&gt; </w:t>
-      </w:r>
-      <w:proofErr w:type="spellStart"/>
-      <w:r>
-        <w:t>sudo</w:t>
-      </w:r>
-      <w:proofErr w:type="spellEnd"/>
-      <w:r>
-        <w:t xml:space="preserve"> </w:t>
-      </w:r>
-      <w:proofErr w:type="spellStart"/>
-      <w:r>
-        <w:t>mysql</w:t>
-      </w:r>
-      <w:proofErr w:type="spellEnd"/>
-      <w:r>
-        <w:t xml:space="preserve"> -u root -p</w:t>
-      </w:r>
-    </w:p>
-    <w:p>
-      <w:pPr>
-        <w:pStyle w:val="ListParagraph"/>
-        <w:jc w:val="center"/>
-      </w:pPr>
-    </w:p>
-    <w:p>
-      <w:pPr>
-        <w:pStyle w:val="ListParagraph"/>
-        <w:jc w:val="center"/>
-      </w:pPr>
-      <w:r>
+        <w:t>Masuk ke root mysql</w:t>
+      </w:r>
+      <w:r>
+        <w:t xml:space="preserve"> =&gt; sudo mysql -u root -p</w:t>
+      </w:r>
+    </w:p>
+    <w:p>
+      <w:pPr>
+        <w:pStyle w:val="ListParagraph"/>
+        <w:jc w:val="center"/>
+      </w:pPr>
+    </w:p>
+    <w:p>
+      <w:pPr>
+        <w:pStyle w:val="ListParagraph"/>
+        <w:jc w:val="center"/>
+      </w:pPr>
+      <w:r>
+        <w:rPr>
+          <w:noProof/>
+        </w:rPr>
         <w:drawing>
           <wp:inline distT="0" distB="0" distL="0" distR="0" wp14:anchorId="47A1E2D1" wp14:editId="5FBD3441">
             <wp:extent cx="4600575" cy="3872720"/>
@@ -2031,7 +1929,7 @@
                     <pic:cNvPicPr/>
                   </pic:nvPicPr>
                   <pic:blipFill>
-                    <a:blip r:embed="rId23"/>
+                    <a:blip r:embed="rId32"/>
                     <a:stretch>
                       <a:fillRect/>
                     </a:stretch>
@@ -2068,22 +1966,20 @@
         <w:pStyle w:val="ListParagraph"/>
         <w:jc w:val="center"/>
       </w:pPr>
-      <w:proofErr w:type="spellStart"/>
       <w:r>
         <w:lastRenderedPageBreak/>
-        <w:t>Tampilkan</w:t>
-      </w:r>
-      <w:proofErr w:type="spellEnd"/>
-      <w:r>
-        <w:t xml:space="preserve"> database di terminal putty =&gt; show databases;</w:t>
-      </w:r>
-    </w:p>
-    <w:p>
-      <w:pPr>
-        <w:pStyle w:val="ListParagraph"/>
-        <w:jc w:val="center"/>
-      </w:pPr>
-      <w:r>
+        <w:t>Tampilkan database di terminal putty =&gt; show databases;</w:t>
+      </w:r>
+    </w:p>
+    <w:p>
+      <w:pPr>
+        <w:pStyle w:val="ListParagraph"/>
+        <w:jc w:val="center"/>
+      </w:pPr>
+      <w:r>
+        <w:rPr>
+          <w:noProof/>
+        </w:rPr>
         <w:drawing>
           <wp:inline distT="0" distB="0" distL="0" distR="0" wp14:anchorId="068DD8EB" wp14:editId="1393C500">
             <wp:extent cx="4809506" cy="4095487"/>
@@ -2100,7 +1996,7 @@
                     <pic:cNvPicPr/>
                   </pic:nvPicPr>
                   <pic:blipFill>
-                    <a:blip r:embed="rId24"/>
+                    <a:blip r:embed="rId33"/>
                     <a:stretch>
                       <a:fillRect/>
                     </a:stretch>
@@ -2131,101 +2027,24 @@
       <w:pPr>
         <w:pStyle w:val="ListParagraph"/>
       </w:pPr>
-      <w:proofErr w:type="spellStart"/>
-      <w:r>
-        <w:t>Mencoba</w:t>
-      </w:r>
-      <w:proofErr w:type="spellEnd"/>
-      <w:r>
-        <w:t xml:space="preserve"> </w:t>
-      </w:r>
-      <w:proofErr w:type="spellStart"/>
-      <w:r>
-        <w:t>menguji</w:t>
-      </w:r>
-      <w:proofErr w:type="spellEnd"/>
-      <w:r>
-        <w:t xml:space="preserve"> </w:t>
-      </w:r>
-      <w:proofErr w:type="spellStart"/>
-      <w:r>
-        <w:t>lagi</w:t>
-      </w:r>
-      <w:proofErr w:type="spellEnd"/>
-      <w:r>
-        <w:t xml:space="preserve"> </w:t>
-      </w:r>
-      <w:proofErr w:type="spellStart"/>
-      <w:r>
-        <w:t>dengan</w:t>
-      </w:r>
-      <w:proofErr w:type="spellEnd"/>
-      <w:r>
-        <w:t xml:space="preserve"> </w:t>
-      </w:r>
-      <w:proofErr w:type="spellStart"/>
-      <w:r>
-        <w:t>menghapus</w:t>
-      </w:r>
-      <w:proofErr w:type="spellEnd"/>
-      <w:r>
-        <w:t xml:space="preserve"> database yang </w:t>
-      </w:r>
-      <w:proofErr w:type="spellStart"/>
-      <w:r>
-        <w:t>tadi</w:t>
-      </w:r>
-      <w:proofErr w:type="spellEnd"/>
-      <w:r>
-        <w:t xml:space="preserve"> </w:t>
-      </w:r>
-      <w:proofErr w:type="spellStart"/>
-      <w:r>
-        <w:t>dibuat</w:t>
-      </w:r>
-      <w:proofErr w:type="spellEnd"/>
-      <w:r>
-        <w:t xml:space="preserve"> </w:t>
-      </w:r>
-      <w:proofErr w:type="spellStart"/>
-      <w:r>
-        <w:t>dimysql</w:t>
-      </w:r>
-      <w:proofErr w:type="spellEnd"/>
-      <w:r>
-        <w:t xml:space="preserve"> workbench</w:t>
-      </w:r>
-    </w:p>
-    <w:p>
-      <w:pPr>
-        <w:pStyle w:val="ListParagraph"/>
-      </w:pPr>
-      <w:r>
-        <w:t xml:space="preserve">=&gt; DROP DATABASE </w:t>
-      </w:r>
-      <w:proofErr w:type="spellStart"/>
-      <w:r>
-        <w:t>test_koneksi</w:t>
-      </w:r>
-      <w:proofErr w:type="spellEnd"/>
-      <w:r>
-        <w:t>;</w:t>
-      </w:r>
-    </w:p>
-    <w:p>
-      <w:pPr>
-        <w:pStyle w:val="ListParagraph"/>
-      </w:pPr>
-      <w:r>
-        <w:t xml:space="preserve">Dan </w:t>
-      </w:r>
-      <w:proofErr w:type="spellStart"/>
-      <w:r>
-        <w:t>tampilkan</w:t>
-      </w:r>
-      <w:proofErr w:type="spellEnd"/>
-      <w:r>
-        <w:t xml:space="preserve"> database</w:t>
+      <w:r>
+        <w:t>Mencoba menguji lagi dengan menghapus database yang tadi dibuat dimysql workbench</w:t>
+      </w:r>
+    </w:p>
+    <w:p>
+      <w:pPr>
+        <w:pStyle w:val="ListParagraph"/>
+      </w:pPr>
+      <w:r>
+        <w:t>=&gt; DROP DATABASE test_koneksi;</w:t>
+      </w:r>
+    </w:p>
+    <w:p>
+      <w:pPr>
+        <w:pStyle w:val="ListParagraph"/>
+      </w:pPr>
+      <w:r>
+        <w:t>Dan tampilkan database</w:t>
       </w:r>
     </w:p>
     <w:p>
@@ -2246,21 +2065,8 @@
         <w:ind w:left="1080"/>
       </w:pPr>
       <w:r>
-        <w:t xml:space="preserve">Dan database </w:t>
-      </w:r>
-      <w:proofErr w:type="spellStart"/>
-      <w:r>
-        <w:t>sudah</w:t>
-      </w:r>
-      <w:proofErr w:type="spellEnd"/>
-      <w:r>
-        <w:t xml:space="preserve"> </w:t>
-      </w:r>
-      <w:proofErr w:type="spellStart"/>
-      <w:r>
-        <w:t>terhapus</w:t>
-      </w:r>
-      <w:proofErr w:type="spellEnd"/>
+        <w:t>Dan database sudah terhapus</w:t>
+      </w:r>
     </w:p>
     <w:p>
       <w:pPr>
@@ -2268,6 +2074,9 @@
         <w:jc w:val="center"/>
       </w:pPr>
       <w:r>
+        <w:rPr>
+          <w:noProof/>
+        </w:rPr>
         <w:drawing>
           <wp:inline distT="0" distB="0" distL="0" distR="0" wp14:anchorId="36B4B24D" wp14:editId="20D3EEE5">
             <wp:extent cx="5141023" cy="3623094"/>
@@ -2284,7 +2093,7 @@
                     <pic:cNvPicPr/>
                   </pic:nvPicPr>
                   <pic:blipFill>
-                    <a:blip r:embed="rId25"/>
+                    <a:blip r:embed="rId34"/>
                     <a:stretch>
                       <a:fillRect/>
                     </a:stretch>
@@ -2311,35 +2120,14 @@
       </w:r>
     </w:p>
     <w:p>
-      <w:proofErr w:type="spellStart"/>
       <w:r>
         <w:lastRenderedPageBreak/>
-        <w:t>Mencoba</w:t>
-      </w:r>
-      <w:proofErr w:type="spellEnd"/>
-      <w:r>
-        <w:t xml:space="preserve"> </w:t>
-      </w:r>
-      <w:proofErr w:type="spellStart"/>
-      <w:r>
-        <w:t>melihat</w:t>
-      </w:r>
-      <w:proofErr w:type="spellEnd"/>
-      <w:r>
-        <w:t xml:space="preserve"> database di terminal VPS dan PUTTY </w:t>
-      </w:r>
-    </w:p>
-    <w:p>
-      <w:r>
-        <w:t>=</w:t>
-      </w:r>
-      <w:proofErr w:type="gramStart"/>
-      <w:r>
-        <w:t>&gt;  SHOW</w:t>
-      </w:r>
-      <w:proofErr w:type="gramEnd"/>
-      <w:r>
-        <w:t xml:space="preserve"> DATABASE;</w:t>
+        <w:t xml:space="preserve">Mencoba melihat database di terminal VPS dan PUTTY </w:t>
+      </w:r>
+    </w:p>
+    <w:p>
+      <w:r>
+        <w:t>=&gt;  SHOW DATABASE;</w:t>
       </w:r>
     </w:p>
     <w:p>
@@ -2347,40 +2135,14 @@
         <w:t xml:space="preserve">VPS </w:t>
       </w:r>
       <w:r>
-        <w:t xml:space="preserve">– database </w:t>
-      </w:r>
-      <w:proofErr w:type="spellStart"/>
-      <w:r>
-        <w:t>sudah</w:t>
-      </w:r>
-      <w:proofErr w:type="spellEnd"/>
-      <w:r>
-        <w:t xml:space="preserve"> </w:t>
-      </w:r>
-      <w:proofErr w:type="spellStart"/>
-      <w:r>
-        <w:t>tidak</w:t>
-      </w:r>
-      <w:proofErr w:type="spellEnd"/>
-      <w:r>
-        <w:t xml:space="preserve"> </w:t>
-      </w:r>
-      <w:proofErr w:type="spellStart"/>
-      <w:r>
-        <w:t>ada</w:t>
-      </w:r>
-      <w:proofErr w:type="spellEnd"/>
-      <w:r>
-        <w:t xml:space="preserve"> / </w:t>
-      </w:r>
-      <w:proofErr w:type="spellStart"/>
-      <w:r>
-        <w:t>terhapus</w:t>
-      </w:r>
-      <w:proofErr w:type="spellEnd"/>
-    </w:p>
-    <w:p>
-      <w:r>
+        <w:t>– database sudah tidak ada / terhapus</w:t>
+      </w:r>
+    </w:p>
+    <w:p>
+      <w:r>
+        <w:rPr>
+          <w:noProof/>
+        </w:rPr>
         <w:drawing>
           <wp:anchor distT="0" distB="0" distL="114300" distR="114300" simplePos="0" relativeHeight="251658240" behindDoc="0" locked="0" layoutInCell="1" allowOverlap="1" wp14:anchorId="6FC52054" wp14:editId="465FCE12">
             <wp:simplePos x="914400" y="1328468"/>
@@ -2405,7 +2167,7 @@
                     <pic:cNvPicPr/>
                   </pic:nvPicPr>
                   <pic:blipFill>
-                    <a:blip r:embed="rId26">
+                    <a:blip r:embed="rId35">
                       <a:extLst>
                         <a:ext uri="{28A0092B-C50C-407E-A947-70E740481C1C}">
                           <a14:useLocalDpi xmlns:a14="http://schemas.microsoft.com/office/drawing/2010/main" val="0"/>
@@ -2441,46 +2203,17 @@
         <w:t xml:space="preserve">PUTTY </w:t>
       </w:r>
       <w:r>
-        <w:t xml:space="preserve"> - </w:t>
-      </w:r>
-      <w:r>
-        <w:t xml:space="preserve">database </w:t>
-      </w:r>
-      <w:proofErr w:type="spellStart"/>
-      <w:r>
-        <w:t>sudah</w:t>
-      </w:r>
-      <w:proofErr w:type="spellEnd"/>
-      <w:r>
-        <w:t xml:space="preserve"> </w:t>
-      </w:r>
-      <w:proofErr w:type="spellStart"/>
-      <w:r>
-        <w:t>tidak</w:t>
-      </w:r>
-      <w:proofErr w:type="spellEnd"/>
-      <w:r>
-        <w:t xml:space="preserve"> </w:t>
-      </w:r>
-      <w:proofErr w:type="spellStart"/>
-      <w:r>
-        <w:t>ada</w:t>
-      </w:r>
-      <w:proofErr w:type="spellEnd"/>
-      <w:r>
-        <w:t xml:space="preserve"> / </w:t>
-      </w:r>
-      <w:proofErr w:type="spellStart"/>
-      <w:r>
-        <w:t>terhapus</w:t>
-      </w:r>
-      <w:proofErr w:type="spellEnd"/>
-    </w:p>
-    <w:p>
-      <w:pPr>
-        <w:jc w:val="center"/>
-      </w:pPr>
-      <w:r>
+        <w:t xml:space="preserve"> - database sudah tidak ada / terhapus</w:t>
+      </w:r>
+    </w:p>
+    <w:p>
+      <w:pPr>
+        <w:jc w:val="center"/>
+      </w:pPr>
+      <w:r>
+        <w:rPr>
+          <w:noProof/>
+        </w:rPr>
         <w:drawing>
           <wp:inline distT="0" distB="0" distL="0" distR="0" wp14:anchorId="16BFA1C2" wp14:editId="62A5B1BD">
             <wp:extent cx="5731510" cy="4163060"/>
@@ -2497,7 +2230,7 @@
                     <pic:cNvPicPr/>
                   </pic:nvPicPr>
                   <pic:blipFill>
-                    <a:blip r:embed="rId27"/>
+                    <a:blip r:embed="rId36"/>
                     <a:stretch>
                       <a:fillRect/>
                     </a:stretch>
@@ -2544,7 +2277,7 @@
 </file>
 
 <file path=word/numbering.xml><?xml version="1.0" encoding="utf-8"?>
-<w:numbering xmlns:wpc="http://schemas.microsoft.com/office/word/2010/wordprocessingCanvas" xmlns:cx="http://schemas.microsoft.com/office/drawing/2014/chartex" xmlns:cx1="http://schemas.microsoft.com/office/drawing/2015/9/8/chartex" xmlns:cx2="http://schemas.microsoft.com/office/drawing/2015/10/21/chartex" xmlns:cx3="http://schemas.microsoft.com/office/drawing/2016/5/9/chartex" xmlns:cx4="http://schemas.microsoft.com/office/drawing/2016/5/10/chartex" xmlns:cx5="http://schemas.microsoft.com/office/drawing/2016/5/11/chartex" xmlns:cx6="http://schemas.microsoft.com/office/drawing/2016/5/12/chartex" xmlns:cx7="http://schemas.microsoft.com/office/drawing/2016/5/13/chartex" xmlns:cx8="http://schemas.microsoft.com/office/drawing/2016/5/14/chartex" xmlns:mc="http://schemas.openxmlformats.org/markup-compatibility/2006" xmlns:aink="http://schemas.microsoft.com/office/drawing/2016/ink" xmlns:am3d="http://schemas.microsoft.com/office/drawing/2017/model3d" xmlns:o="urn:schemas-microsoft-com:office:office" xmlns:oel="http://schemas.microsoft.com/office/2019/extlst" xmlns:r="http://schemas.openxmlformats.org/officeDocument/2006/relationships" xmlns:m="http://schemas.openxmlformats.org/officeDocument/2006/math" xmlns:v="urn:schemas-microsoft-com:vml" xmlns:wp14="http://schemas.microsoft.com/office/word/2010/wordprocessingDrawing" xmlns:wp="http://schemas.openxmlformats.org/drawingml/2006/wordprocessingDrawing" xmlns:w10="urn:schemas-microsoft-com:office:word" xmlns:w="http://schemas.openxmlformats.org/wordprocessingml/2006/main" xmlns:w14="http://schemas.microsoft.com/office/word/2010/wordml" xmlns:w15="http://schemas.microsoft.com/office/word/2012/wordml" xmlns:w16cex="http://schemas.microsoft.com/office/word/2018/wordml/cex" xmlns:w16cid="http://schemas.microsoft.com/office/word/2016/wordml/cid" xmlns:w16="http://schemas.microsoft.com/office/word/2018/wordml" xmlns:w16du="http://schemas.microsoft.com/office/word/2023/wordml/word16du" xmlns:w16sdtdh="http://schemas.microsoft.com/office/word/2020/wordml/sdtdatahash" xmlns:w16sdtfl="http://schemas.microsoft.com/office/word/2024/wordml/sdtformatlock" xmlns:w16se="http://schemas.microsoft.com/office/word/2015/wordml/symex" xmlns:wpg="http://schemas.microsoft.com/office/word/2010/wordprocessingGroup" xmlns:wpi="http://schemas.microsoft.com/office/word/2010/wordprocessingInk" xmlns:wne="http://schemas.microsoft.com/office/word/2006/wordml" xmlns:wps="http://schemas.microsoft.com/office/word/2010/wordprocessingShape" mc:Ignorable="w14 w15 w16se w16cid w16 w16cex w16sdtdh w16sdtfl w16du wp14">
+<w:numbering xmlns:wpc="http://schemas.microsoft.com/office/word/2010/wordprocessingCanvas" xmlns:cx="http://schemas.microsoft.com/office/drawing/2014/chartex" xmlns:cx1="http://schemas.microsoft.com/office/drawing/2015/9/8/chartex" xmlns:cx2="http://schemas.microsoft.com/office/drawing/2015/10/21/chartex" xmlns:cx3="http://schemas.microsoft.com/office/drawing/2016/5/9/chartex" xmlns:cx4="http://schemas.microsoft.com/office/drawing/2016/5/10/chartex" xmlns:cx5="http://schemas.microsoft.com/office/drawing/2016/5/11/chartex" xmlns:cx6="http://schemas.microsoft.com/office/drawing/2016/5/12/chartex" xmlns:cx7="http://schemas.microsoft.com/office/drawing/2016/5/13/chartex" xmlns:cx8="http://schemas.microsoft.com/office/drawing/2016/5/14/chartex" xmlns:mc="http://schemas.openxmlformats.org/markup-compatibility/2006" xmlns:aink="http://schemas.microsoft.com/office/drawing/2016/ink" xmlns:am3d="http://schemas.microsoft.com/office/drawing/2017/model3d" xmlns:o="urn:schemas-microsoft-com:office:office" xmlns:r="http://schemas.openxmlformats.org/officeDocument/2006/relationships" xmlns:m="http://schemas.openxmlformats.org/officeDocument/2006/math" xmlns:v="urn:schemas-microsoft-com:vml" xmlns:wp14="http://schemas.microsoft.com/office/word/2010/wordprocessingDrawing" xmlns:wp="http://schemas.openxmlformats.org/drawingml/2006/wordprocessingDrawing" xmlns:w10="urn:schemas-microsoft-com:office:word" xmlns:w="http://schemas.openxmlformats.org/wordprocessingml/2006/main" xmlns:w14="http://schemas.microsoft.com/office/word/2010/wordml" xmlns:w15="http://schemas.microsoft.com/office/word/2012/wordml" xmlns:w16cex="http://schemas.microsoft.com/office/word/2018/wordml/cex" xmlns:w16cid="http://schemas.microsoft.com/office/word/2016/wordml/cid" xmlns:w16="http://schemas.microsoft.com/office/word/2018/wordml" xmlns:w16se="http://schemas.microsoft.com/office/word/2015/wordml/symex" xmlns:wpg="http://schemas.microsoft.com/office/word/2010/wordprocessingGroup" xmlns:wpi="http://schemas.microsoft.com/office/word/2010/wordprocessingInk" xmlns:wne="http://schemas.microsoft.com/office/word/2006/wordml" xmlns:wps="http://schemas.microsoft.com/office/word/2010/wordprocessingShape" mc:Ignorable="w14 w15 w16se w16cid w16 w16cex wp14">
   <w:abstractNum w:abstractNumId="0" w15:restartNumberingAfterBreak="0">
     <w:nsid w:val="05096B18"/>
     <w:multiLevelType w:val="hybridMultilevel"/>
@@ -2637,6 +2370,95 @@
     </w:lvl>
   </w:abstractNum>
   <w:abstractNum w:abstractNumId="1" w15:restartNumberingAfterBreak="0">
+    <w:nsid w:val="120031DB"/>
+    <w:multiLevelType w:val="hybridMultilevel"/>
+    <w:tmpl w:val="455C44CE"/>
+    <w:lvl w:ilvl="0" w:tplc="3809000F">
+      <w:start w:val="1"/>
+      <w:numFmt w:val="decimal"/>
+      <w:lvlText w:val="%1."/>
+      <w:lvlJc w:val="left"/>
+      <w:pPr>
+        <w:ind w:left="720" w:hanging="360"/>
+      </w:pPr>
+      <w:rPr>
+        <w:rFonts w:hint="default"/>
+      </w:rPr>
+    </w:lvl>
+    <w:lvl w:ilvl="1" w:tplc="38090019" w:tentative="1">
+      <w:start w:val="1"/>
+      <w:numFmt w:val="lowerLetter"/>
+      <w:lvlText w:val="%2."/>
+      <w:lvlJc w:val="left"/>
+      <w:pPr>
+        <w:ind w:left="1440" w:hanging="360"/>
+      </w:pPr>
+    </w:lvl>
+    <w:lvl w:ilvl="2" w:tplc="3809001B" w:tentative="1">
+      <w:start w:val="1"/>
+      <w:numFmt w:val="lowerRoman"/>
+      <w:lvlText w:val="%3."/>
+      <w:lvlJc w:val="right"/>
+      <w:pPr>
+        <w:ind w:left="2160" w:hanging="180"/>
+      </w:pPr>
+    </w:lvl>
+    <w:lvl w:ilvl="3" w:tplc="3809000F" w:tentative="1">
+      <w:start w:val="1"/>
+      <w:numFmt w:val="decimal"/>
+      <w:lvlText w:val="%4."/>
+      <w:lvlJc w:val="left"/>
+      <w:pPr>
+        <w:ind w:left="2880" w:hanging="360"/>
+      </w:pPr>
+    </w:lvl>
+    <w:lvl w:ilvl="4" w:tplc="38090019" w:tentative="1">
+      <w:start w:val="1"/>
+      <w:numFmt w:val="lowerLetter"/>
+      <w:lvlText w:val="%5."/>
+      <w:lvlJc w:val="left"/>
+      <w:pPr>
+        <w:ind w:left="3600" w:hanging="360"/>
+      </w:pPr>
+    </w:lvl>
+    <w:lvl w:ilvl="5" w:tplc="3809001B" w:tentative="1">
+      <w:start w:val="1"/>
+      <w:numFmt w:val="lowerRoman"/>
+      <w:lvlText w:val="%6."/>
+      <w:lvlJc w:val="right"/>
+      <w:pPr>
+        <w:ind w:left="4320" w:hanging="180"/>
+      </w:pPr>
+    </w:lvl>
+    <w:lvl w:ilvl="6" w:tplc="3809000F" w:tentative="1">
+      <w:start w:val="1"/>
+      <w:numFmt w:val="decimal"/>
+      <w:lvlText w:val="%7."/>
+      <w:lvlJc w:val="left"/>
+      <w:pPr>
+        <w:ind w:left="5040" w:hanging="360"/>
+      </w:pPr>
+    </w:lvl>
+    <w:lvl w:ilvl="7" w:tplc="38090019" w:tentative="1">
+      <w:start w:val="1"/>
+      <w:numFmt w:val="lowerLetter"/>
+      <w:lvlText w:val="%8."/>
+      <w:lvlJc w:val="left"/>
+      <w:pPr>
+        <w:ind w:left="5760" w:hanging="360"/>
+      </w:pPr>
+    </w:lvl>
+    <w:lvl w:ilvl="8" w:tplc="3809001B" w:tentative="1">
+      <w:start w:val="1"/>
+      <w:numFmt w:val="lowerRoman"/>
+      <w:lvlText w:val="%9."/>
+      <w:lvlJc w:val="right"/>
+      <w:pPr>
+        <w:ind w:left="6480" w:hanging="180"/>
+      </w:pPr>
+    </w:lvl>
+  </w:abstractNum>
+  <w:abstractNum w:abstractNumId="2" w15:restartNumberingAfterBreak="0">
     <w:nsid w:val="3EC67B4A"/>
     <w:multiLevelType w:val="hybridMultilevel"/>
     <w:tmpl w:val="E8F82AF4"/>
@@ -2725,7 +2547,7 @@
       </w:pPr>
     </w:lvl>
   </w:abstractNum>
-  <w:abstractNum w:abstractNumId="2" w15:restartNumberingAfterBreak="0">
+  <w:abstractNum w:abstractNumId="3" w15:restartNumberingAfterBreak="0">
     <w:nsid w:val="53B81223"/>
     <w:multiLevelType w:val="hybridMultilevel"/>
     <w:tmpl w:val="69B84232"/>
@@ -2814,7 +2636,7 @@
       </w:pPr>
     </w:lvl>
   </w:abstractNum>
-  <w:abstractNum w:abstractNumId="3" w15:restartNumberingAfterBreak="0">
+  <w:abstractNum w:abstractNumId="4" w15:restartNumberingAfterBreak="0">
     <w:nsid w:val="5C503B4F"/>
     <w:multiLevelType w:val="hybridMultilevel"/>
     <w:tmpl w:val="2142391A"/>
@@ -2903,7 +2725,7 @@
       </w:pPr>
     </w:lvl>
   </w:abstractNum>
-  <w:abstractNum w:abstractNumId="4" w15:restartNumberingAfterBreak="0">
+  <w:abstractNum w:abstractNumId="5" w15:restartNumberingAfterBreak="0">
     <w:nsid w:val="5F4E7AA9"/>
     <w:multiLevelType w:val="hybridMultilevel"/>
     <w:tmpl w:val="4ACAB7E4"/>
@@ -3016,26 +2838,121 @@
       </w:rPr>
     </w:lvl>
   </w:abstractNum>
-  <w:num w:numId="1" w16cid:durableId="588973238">
+  <w:abstractNum w:abstractNumId="6" w15:restartNumberingAfterBreak="0">
+    <w:nsid w:val="7F071363"/>
+    <w:multiLevelType w:val="hybridMultilevel"/>
+    <w:tmpl w:val="455C44CE"/>
+    <w:lvl w:ilvl="0" w:tplc="3809000F">
+      <w:start w:val="1"/>
+      <w:numFmt w:val="decimal"/>
+      <w:lvlText w:val="%1."/>
+      <w:lvlJc w:val="left"/>
+      <w:pPr>
+        <w:ind w:left="720" w:hanging="360"/>
+      </w:pPr>
+      <w:rPr>
+        <w:rFonts w:hint="default"/>
+      </w:rPr>
+    </w:lvl>
+    <w:lvl w:ilvl="1" w:tplc="38090019" w:tentative="1">
+      <w:start w:val="1"/>
+      <w:numFmt w:val="lowerLetter"/>
+      <w:lvlText w:val="%2."/>
+      <w:lvlJc w:val="left"/>
+      <w:pPr>
+        <w:ind w:left="1440" w:hanging="360"/>
+      </w:pPr>
+    </w:lvl>
+    <w:lvl w:ilvl="2" w:tplc="3809001B" w:tentative="1">
+      <w:start w:val="1"/>
+      <w:numFmt w:val="lowerRoman"/>
+      <w:lvlText w:val="%3."/>
+      <w:lvlJc w:val="right"/>
+      <w:pPr>
+        <w:ind w:left="2160" w:hanging="180"/>
+      </w:pPr>
+    </w:lvl>
+    <w:lvl w:ilvl="3" w:tplc="3809000F" w:tentative="1">
+      <w:start w:val="1"/>
+      <w:numFmt w:val="decimal"/>
+      <w:lvlText w:val="%4."/>
+      <w:lvlJc w:val="left"/>
+      <w:pPr>
+        <w:ind w:left="2880" w:hanging="360"/>
+      </w:pPr>
+    </w:lvl>
+    <w:lvl w:ilvl="4" w:tplc="38090019" w:tentative="1">
+      <w:start w:val="1"/>
+      <w:numFmt w:val="lowerLetter"/>
+      <w:lvlText w:val="%5."/>
+      <w:lvlJc w:val="left"/>
+      <w:pPr>
+        <w:ind w:left="3600" w:hanging="360"/>
+      </w:pPr>
+    </w:lvl>
+    <w:lvl w:ilvl="5" w:tplc="3809001B" w:tentative="1">
+      <w:start w:val="1"/>
+      <w:numFmt w:val="lowerRoman"/>
+      <w:lvlText w:val="%6."/>
+      <w:lvlJc w:val="right"/>
+      <w:pPr>
+        <w:ind w:left="4320" w:hanging="180"/>
+      </w:pPr>
+    </w:lvl>
+    <w:lvl w:ilvl="6" w:tplc="3809000F" w:tentative="1">
+      <w:start w:val="1"/>
+      <w:numFmt w:val="decimal"/>
+      <w:lvlText w:val="%7."/>
+      <w:lvlJc w:val="left"/>
+      <w:pPr>
+        <w:ind w:left="5040" w:hanging="360"/>
+      </w:pPr>
+    </w:lvl>
+    <w:lvl w:ilvl="7" w:tplc="38090019" w:tentative="1">
+      <w:start w:val="1"/>
+      <w:numFmt w:val="lowerLetter"/>
+      <w:lvlText w:val="%8."/>
+      <w:lvlJc w:val="left"/>
+      <w:pPr>
+        <w:ind w:left="5760" w:hanging="360"/>
+      </w:pPr>
+    </w:lvl>
+    <w:lvl w:ilvl="8" w:tplc="3809001B" w:tentative="1">
+      <w:start w:val="1"/>
+      <w:numFmt w:val="lowerRoman"/>
+      <w:lvlText w:val="%9."/>
+      <w:lvlJc w:val="right"/>
+      <w:pPr>
+        <w:ind w:left="6480" w:hanging="180"/>
+      </w:pPr>
+    </w:lvl>
+  </w:abstractNum>
+  <w:num w:numId="1">
+    <w:abstractNumId w:val="2"/>
+  </w:num>
+  <w:num w:numId="2">
+    <w:abstractNumId w:val="3"/>
+  </w:num>
+  <w:num w:numId="3">
+    <w:abstractNumId w:val="4"/>
+  </w:num>
+  <w:num w:numId="4">
+    <w:abstractNumId w:val="0"/>
+  </w:num>
+  <w:num w:numId="5">
+    <w:abstractNumId w:val="5"/>
+  </w:num>
+  <w:num w:numId="6">
     <w:abstractNumId w:val="1"/>
   </w:num>
-  <w:num w:numId="2" w16cid:durableId="726222706">
-    <w:abstractNumId w:val="2"/>
-  </w:num>
-  <w:num w:numId="3" w16cid:durableId="925966618">
-    <w:abstractNumId w:val="3"/>
-  </w:num>
-  <w:num w:numId="4" w16cid:durableId="1020474991">
-    <w:abstractNumId w:val="0"/>
-  </w:num>
-  <w:num w:numId="5" w16cid:durableId="199056507">
-    <w:abstractNumId w:val="4"/>
+  <w:num w:numId="7">
+    <w:abstractNumId w:val="6"/>
   </w:num>
 </w:numbering>
 </file>
 
 <file path=word/styles.xml><?xml version="1.0" encoding="utf-8"?>
-<w:styles xmlns:mc="http://schemas.openxmlformats.org/markup-compatibility/2006" xmlns:r="http://schemas.openxmlformats.org/officeDocument/2006/relationships" xmlns:w="http://schemas.openxmlformats.org/wordprocessingml/2006/main" xmlns:w14="http://schemas.microsoft.com/office/word/2010/wordml" xmlns:w15="http://schemas.microsoft.com/office/word/2012/wordml" xmlns:w16cex="http://schemas.microsoft.com/office/word/2018/wordml/cex" xmlns:w16cid="http://schemas.microsoft.com/office/word/2016/wordml/cid" xmlns:w16="http://schemas.microsoft.com/office/word/2018/wordml" xmlns:w16du="http://schemas.microsoft.com/office/word/2023/wordml/word16du" xmlns:w16sdtdh="http://schemas.microsoft.com/office/word/2020/wordml/sdtdatahash" xmlns:w16sdtfl="http://schemas.microsoft.com/office/word/2024/wordml/sdtformatlock" xmlns:w16se="http://schemas.microsoft.com/office/word/2015/wordml/symex" mc:Ignorable="w14 w15 w16se w16cid w16 w16cex w16sdtdh w16sdtfl w16du">
+<w:styles xmlns:mc="http://schemas.openxmlformats.org/markup-compatibility/2006" xmlns:r="http://schemas.openxmlformats.org/officeDocument/2006/relationships" xmlns:w="http://schemas.openxmlformats.org/wordprocessingml/2006/main" xmlns:w14="http://schemas.microsoft.com/office/word/2010/wordml" xmlns:w15="http://schemas.microsoft.com/office/word/2012/wordml" xmlns:w16cex="http://schemas.microsoft.com/office/word/2018/wordml/cex" xmlns:w16cid="http://schemas.microsoft.com/office/word/2016/wordml/cid" xmlns:w16="http://schemas.microsoft.com/office/word/2018/wordml" xmlns:w16se="http://schemas.microsoft.com/office/word/2015/wordml/symex" mc:Ignorable="w14 w15 w16se w16cid w16 w16cex">
   <w:docDefaults>
     <w:rPrDefault>
       <w:rPr>
@@ -3637,6 +3554,7 @@
   <w:style w:type="character" w:default="1" w:styleId="DefaultParagraphFont">
     <w:name w:val="Default Paragraph Font"/>
     <w:uiPriority w:val="1"/>
+    <w:semiHidden/>
     <w:unhideWhenUsed/>
   </w:style>
   <w:style w:type="table" w:default="1" w:styleId="TableNormal">

</xml_diff>